<commit_message>
adding means, table and working on graphics
</commit_message>
<xml_diff>
--- a/Outline.docx
+++ b/Outline.docx
@@ -2,37 +2,6 @@
 <file path=word/document.xml><?xml version="1.0" encoding="utf-8"?>
 <w:document xmlns:wpc="http://schemas.microsoft.com/office/word/2010/wordprocessingCanvas" xmlns:cx="http://schemas.microsoft.com/office/drawing/2014/chartex" xmlns:cx1="http://schemas.microsoft.com/office/drawing/2015/9/8/chartex" xmlns:mc="http://schemas.openxmlformats.org/markup-compatibility/2006" xmlns:o="urn:schemas-microsoft-com:office:office" xmlns:r="http://schemas.openxmlformats.org/officeDocument/2006/relationships" xmlns:m="http://schemas.openxmlformats.org/officeDocument/2006/math" xmlns:v="urn:schemas-microsoft-com:vml" xmlns:wp14="http://schemas.microsoft.com/office/word/2010/wordprocessingDrawing" xmlns:wp="http://schemas.openxmlformats.org/drawingml/2006/wordprocessingDrawing" xmlns:w10="urn:schemas-microsoft-com:office:word" xmlns:w="http://schemas.openxmlformats.org/wordprocessingml/2006/main" xmlns:w14="http://schemas.microsoft.com/office/word/2010/wordml" xmlns:w15="http://schemas.microsoft.com/office/word/2012/wordml" xmlns:w16se="http://schemas.microsoft.com/office/word/2015/wordml/symex" xmlns:wpg="http://schemas.microsoft.com/office/word/2010/wordprocessingGroup" xmlns:wpi="http://schemas.microsoft.com/office/word/2010/wordprocessingInk" xmlns:wne="http://schemas.microsoft.com/office/word/2006/wordml" xmlns:wps="http://schemas.microsoft.com/office/word/2010/wordprocessingShape" mc:Ignorable="w14 w15 w16se wp14">
   <w:body>
-    <w:p>
-      <w:pPr>
-        <w:rPr>
-          <w:b/>
-          <w:lang w:val="en-US"/>
-        </w:rPr>
-      </w:pPr>
-      <w:r>
-        <w:rPr>
-          <w:b/>
-          <w:lang w:val="en-US"/>
-        </w:rPr>
-        <w:t xml:space="preserve">Nitrogen Addition does not boost </w:t>
-      </w:r>
-      <w:proofErr w:type="spellStart"/>
-      <w:r>
-        <w:rPr>
-          <w:b/>
-          <w:lang w:val="en-US"/>
-        </w:rPr>
-        <w:t>iWUE</w:t>
-      </w:r>
-      <w:proofErr w:type="spellEnd"/>
-      <w:r>
-        <w:rPr>
-          <w:b/>
-          <w:lang w:val="en-US"/>
-        </w:rPr>
-        <w:t xml:space="preserve"> (temporal scale, this is only one year).</w:t>
-      </w:r>
-    </w:p>
     <w:p>
       <w:pPr>
         <w:rPr>
@@ -63,25 +32,25 @@
         <w:rPr>
           <w:lang w:val="en-US"/>
         </w:rPr>
-        <w:t>Nutrient depositi</w:t>
-      </w:r>
-      <w:r>
-        <w:rPr>
-          <w:lang w:val="en-US"/>
-        </w:rPr>
-        <w:t>on on tropical mountain forests + atmospheric fertilization</w:t>
-      </w:r>
-      <w:r>
-        <w:rPr>
-          <w:lang w:val="en-US"/>
-        </w:rPr>
-        <w:t xml:space="preserve"> and warming</w:t>
-      </w:r>
-      <w:r>
-        <w:rPr>
-          <w:lang w:val="en-US"/>
-        </w:rPr>
-        <w:t>.</w:t>
+        <w:t>Rising atmospheric concentrations of CO2 plus n</w:t>
+      </w:r>
+      <w:r>
+        <w:rPr>
+          <w:lang w:val="en-US"/>
+        </w:rPr>
+        <w:t>utrient depositi</w:t>
+      </w:r>
+      <w:r>
+        <w:rPr>
+          <w:lang w:val="en-US"/>
+        </w:rPr>
+        <w:t>on</w:t>
+      </w:r>
+      <w:r>
+        <w:rPr>
+          <w:lang w:val="en-US"/>
+        </w:rPr>
+        <w:t xml:space="preserve"> on tropical mountain forests interaction and influence on ecosystems function is scarce.</w:t>
       </w:r>
     </w:p>
     <w:p>
@@ -105,7 +74,7 @@
         <w:rPr>
           <w:lang w:val="en-US"/>
         </w:rPr>
-        <w:t xml:space="preserve"> N or P limitation changing. </w:t>
+        <w:t xml:space="preserve"> N or P limitation changing.</w:t>
       </w:r>
     </w:p>
     <w:p>
@@ -123,27 +92,7 @@
         <w:rPr>
           <w:lang w:val="en-US"/>
         </w:rPr>
-        <w:t>Previous studies that have performed fertilization experiments to measur</w:t>
-      </w:r>
-      <w:r>
-        <w:rPr>
-          <w:lang w:val="en-US"/>
-        </w:rPr>
-        <w:t xml:space="preserve">e traits and </w:t>
-      </w:r>
-      <w:proofErr w:type="spellStart"/>
-      <w:r>
-        <w:rPr>
-          <w:lang w:val="en-US"/>
-        </w:rPr>
-        <w:t>iWUE</w:t>
-      </w:r>
-      <w:proofErr w:type="spellEnd"/>
-      <w:r>
-        <w:rPr>
-          <w:lang w:val="en-US"/>
-        </w:rPr>
-        <w:t xml:space="preserve"> relationship are scarce.</w:t>
+        <w:t>Data on NUMEX previous reports and the year the experiment started.</w:t>
       </w:r>
     </w:p>
     <w:p>
@@ -161,22 +110,50 @@
         <w:rPr>
           <w:lang w:val="en-US"/>
         </w:rPr>
-        <w:t xml:space="preserve">Our hypothesis and approach. </w:t>
-      </w:r>
-    </w:p>
-    <w:p>
-      <w:pPr>
-        <w:rPr>
-          <w:b/>
-          <w:lang w:val="en-US"/>
-        </w:rPr>
-      </w:pPr>
-      <w:r>
-        <w:rPr>
-          <w:b/>
-          <w:lang w:val="en-US"/>
-        </w:rPr>
-        <w:t>Material and methods.</w:t>
+        <w:t>Previous studies that have performed fertilization experiments to measur</w:t>
+      </w:r>
+      <w:r>
+        <w:rPr>
+          <w:lang w:val="en-US"/>
+        </w:rPr>
+        <w:t xml:space="preserve">e traits and </w:t>
+      </w:r>
+      <w:proofErr w:type="spellStart"/>
+      <w:r>
+        <w:rPr>
+          <w:lang w:val="en-US"/>
+        </w:rPr>
+        <w:t>iWUE</w:t>
+      </w:r>
+      <w:proofErr w:type="spellEnd"/>
+      <w:r>
+        <w:rPr>
+          <w:lang w:val="en-US"/>
+        </w:rPr>
+        <w:t xml:space="preserve"> relationship are scarce.</w:t>
+      </w:r>
+      <w:bookmarkStart w:id="0" w:name="_GoBack"/>
+      <w:bookmarkEnd w:id="0"/>
+    </w:p>
+    <w:p>
+      <w:pPr>
+        <w:rPr>
+          <w:lang w:val="en-US"/>
+        </w:rPr>
+      </w:pPr>
+      <w:proofErr w:type="spellStart"/>
+      <w:r>
+        <w:rPr>
+          <w:lang w:val="en-US"/>
+        </w:rPr>
+        <w:t>Hipothesis</w:t>
+      </w:r>
+      <w:proofErr w:type="spellEnd"/>
+      <w:r>
+        <w:rPr>
+          <w:lang w:val="en-US"/>
+        </w:rPr>
+        <w:t xml:space="preserve">: </w:t>
       </w:r>
     </w:p>
     <w:p>
@@ -194,7 +171,21 @@
         <w:rPr>
           <w:lang w:val="en-US"/>
         </w:rPr>
-        <w:t>Site description.</w:t>
+        <w:t xml:space="preserve">Increased N deposition can influence </w:t>
+      </w:r>
+      <w:proofErr w:type="spellStart"/>
+      <w:r>
+        <w:rPr>
+          <w:lang w:val="en-US"/>
+        </w:rPr>
+        <w:t>iWUE</w:t>
+      </w:r>
+      <w:proofErr w:type="spellEnd"/>
+      <w:r>
+        <w:rPr>
+          <w:lang w:val="en-US"/>
+        </w:rPr>
+        <w:t xml:space="preserve"> via increases in foliar [N) and photosynthetic capacity in N-limited ecosystems (Huang et al., 2016)</w:t>
       </w:r>
     </w:p>
     <w:p>
@@ -212,7 +203,22 @@
         <w:rPr>
           <w:lang w:val="en-US"/>
         </w:rPr>
-        <w:t>Experimental setup.</w:t>
+        <w:t>Which ecosystems are N-Limited</w:t>
+      </w:r>
+    </w:p>
+    <w:p>
+      <w:pPr>
+        <w:rPr>
+          <w:b/>
+          <w:lang w:val="en-US"/>
+        </w:rPr>
+      </w:pPr>
+      <w:r>
+        <w:rPr>
+          <w:b/>
+          <w:lang w:val="en-US"/>
+        </w:rPr>
+        <w:t>Material and methods.</w:t>
       </w:r>
     </w:p>
     <w:p>
@@ -230,7 +236,7 @@
         <w:rPr>
           <w:lang w:val="en-US"/>
         </w:rPr>
-        <w:t>Collection: functional traits + cellulose extraction – isotope measurement and nutrients (N).</w:t>
+        <w:t>Site description.</w:t>
       </w:r>
     </w:p>
     <w:p>
@@ -248,6 +254,42 @@
         <w:rPr>
           <w:lang w:val="en-US"/>
         </w:rPr>
+        <w:t>Experimental setup.</w:t>
+      </w:r>
+    </w:p>
+    <w:p>
+      <w:pPr>
+        <w:pStyle w:val="Prrafodelista"/>
+        <w:numPr>
+          <w:ilvl w:val="0"/>
+          <w:numId w:val="1"/>
+        </w:numPr>
+        <w:rPr>
+          <w:lang w:val="en-US"/>
+        </w:rPr>
+      </w:pPr>
+      <w:r>
+        <w:rPr>
+          <w:lang w:val="en-US"/>
+        </w:rPr>
+        <w:t>Collection: functional traits + cellulose extraction – isotope measurement and nutrients (N).</w:t>
+      </w:r>
+    </w:p>
+    <w:p>
+      <w:pPr>
+        <w:pStyle w:val="Prrafodelista"/>
+        <w:numPr>
+          <w:ilvl w:val="0"/>
+          <w:numId w:val="1"/>
+        </w:numPr>
+        <w:rPr>
+          <w:lang w:val="en-US"/>
+        </w:rPr>
+      </w:pPr>
+      <w:r>
+        <w:rPr>
+          <w:lang w:val="en-US"/>
+        </w:rPr>
         <w:t>Calculations and statistical analysis.</w:t>
       </w:r>
     </w:p>
@@ -384,8 +426,6 @@
         </w:rPr>
         <w:t>Treatment effects on species at different elevations.</w:t>
       </w:r>
-      <w:bookmarkStart w:id="0" w:name="_GoBack"/>
-      <w:bookmarkEnd w:id="0"/>
     </w:p>
     <w:p>
       <w:pPr>

</xml_diff>

<commit_message>
error rasgos Bombuscaro, outliers, graphs
</commit_message>
<xml_diff>
--- a/Outline.docx
+++ b/Outline.docx
@@ -2,6 +2,13 @@
 <file path=word/document.xml><?xml version="1.0" encoding="utf-8"?>
 <w:document xmlns:wpc="http://schemas.microsoft.com/office/word/2010/wordprocessingCanvas" xmlns:cx="http://schemas.microsoft.com/office/drawing/2014/chartex" xmlns:cx1="http://schemas.microsoft.com/office/drawing/2015/9/8/chartex" xmlns:mc="http://schemas.openxmlformats.org/markup-compatibility/2006" xmlns:o="urn:schemas-microsoft-com:office:office" xmlns:r="http://schemas.openxmlformats.org/officeDocument/2006/relationships" xmlns:m="http://schemas.openxmlformats.org/officeDocument/2006/math" xmlns:v="urn:schemas-microsoft-com:vml" xmlns:wp14="http://schemas.microsoft.com/office/word/2010/wordprocessingDrawing" xmlns:wp="http://schemas.openxmlformats.org/drawingml/2006/wordprocessingDrawing" xmlns:w10="urn:schemas-microsoft-com:office:word" xmlns:w="http://schemas.openxmlformats.org/wordprocessingml/2006/main" xmlns:w14="http://schemas.microsoft.com/office/word/2010/wordml" xmlns:w15="http://schemas.microsoft.com/office/word/2012/wordml" xmlns:w16se="http://schemas.microsoft.com/office/word/2015/wordml/symex" xmlns:wpg="http://schemas.microsoft.com/office/word/2010/wordprocessingGroup" xmlns:wpi="http://schemas.microsoft.com/office/word/2010/wordprocessingInk" xmlns:wne="http://schemas.microsoft.com/office/word/2006/wordml" xmlns:wps="http://schemas.microsoft.com/office/word/2010/wordprocessingShape" mc:Ignorable="w14 w15 w16se wp14">
   <w:body>
+    <w:p>
+      <w:pPr>
+        <w:rPr>
+          <w:b/>
+        </w:rPr>
+      </w:pPr>
+    </w:p>
     <w:p>
       <w:pPr>
         <w:rPr>
@@ -132,29 +139,32 @@
         </w:rPr>
         <w:t xml:space="preserve"> relationship are scarce.</w:t>
       </w:r>
+    </w:p>
+    <w:p>
+      <w:pPr>
+        <w:rPr>
+          <w:b/>
+          <w:lang w:val="en-US"/>
+        </w:rPr>
+      </w:pPr>
+      <w:proofErr w:type="spellStart"/>
+      <w:r>
+        <w:rPr>
+          <w:b/>
+          <w:lang w:val="en-US"/>
+        </w:rPr>
+        <w:t>Hipothesis</w:t>
+      </w:r>
+      <w:proofErr w:type="spellEnd"/>
+      <w:r>
+        <w:rPr>
+          <w:b/>
+          <w:lang w:val="en-US"/>
+        </w:rPr>
+        <w:t xml:space="preserve">: </w:t>
+      </w:r>
       <w:bookmarkStart w:id="0" w:name="_GoBack"/>
       <w:bookmarkEnd w:id="0"/>
-    </w:p>
-    <w:p>
-      <w:pPr>
-        <w:rPr>
-          <w:lang w:val="en-US"/>
-        </w:rPr>
-      </w:pPr>
-      <w:proofErr w:type="spellStart"/>
-      <w:r>
-        <w:rPr>
-          <w:lang w:val="en-US"/>
-        </w:rPr>
-        <w:t>Hipothesis</w:t>
-      </w:r>
-      <w:proofErr w:type="spellEnd"/>
-      <w:r>
-        <w:rPr>
-          <w:lang w:val="en-US"/>
-        </w:rPr>
-        <w:t xml:space="preserve">: </w:t>
-      </w:r>
     </w:p>
     <w:p>
       <w:pPr>
@@ -164,11 +174,13 @@
           <w:numId w:val="1"/>
         </w:numPr>
         <w:rPr>
-          <w:lang w:val="en-US"/>
-        </w:rPr>
-      </w:pPr>
-      <w:r>
-        <w:rPr>
+          <w:b/>
+          <w:lang w:val="en-US"/>
+        </w:rPr>
+      </w:pPr>
+      <w:r>
+        <w:rPr>
+          <w:b/>
           <w:lang w:val="en-US"/>
         </w:rPr>
         <w:t xml:space="preserve">Increased N deposition can influence </w:t>
@@ -176,6 +188,7 @@
       <w:proofErr w:type="spellStart"/>
       <w:r>
         <w:rPr>
+          <w:b/>
           <w:lang w:val="en-US"/>
         </w:rPr>
         <w:t>iWUE</w:t>
@@ -183,6 +196,7 @@
       <w:proofErr w:type="spellEnd"/>
       <w:r>
         <w:rPr>
+          <w:b/>
           <w:lang w:val="en-US"/>
         </w:rPr>
         <w:t xml:space="preserve"> via increases in foliar [N) and photosynthetic capacity in N-limited ecosystems (Huang et al., 2016)</w:t>
@@ -196,11 +210,13 @@
           <w:numId w:val="1"/>
         </w:numPr>
         <w:rPr>
-          <w:lang w:val="en-US"/>
-        </w:rPr>
-      </w:pPr>
-      <w:r>
-        <w:rPr>
+          <w:b/>
+          <w:lang w:val="en-US"/>
+        </w:rPr>
+      </w:pPr>
+      <w:r>
+        <w:rPr>
+          <w:b/>
           <w:lang w:val="en-US"/>
         </w:rPr>
         <w:t>Which ecosystems are N-Limited</w:t>

</xml_diff>

<commit_message>
edit dummies colors revisando SLA
</commit_message>
<xml_diff>
--- a/Outline.docx
+++ b/Outline.docx
@@ -75,13 +75,25 @@
         <w:rPr>
           <w:lang w:val="en-US"/>
         </w:rPr>
-        <w:t>Biogeochemistry on montane forests.</w:t>
-      </w:r>
-      <w:r>
-        <w:rPr>
-          <w:lang w:val="en-US"/>
-        </w:rPr>
-        <w:t xml:space="preserve"> N or P limitation changing.</w:t>
+        <w:t>Bio</w:t>
+      </w:r>
+      <w:r>
+        <w:rPr>
+          <w:lang w:val="en-US"/>
+        </w:rPr>
+        <w:t>geochemistry on montane forests:</w:t>
+      </w:r>
+      <w:r>
+        <w:rPr>
+          <w:lang w:val="en-US"/>
+        </w:rPr>
+        <w:t xml:space="preserve"> N or P limitation </w:t>
+      </w:r>
+      <w:r>
+        <w:rPr>
+          <w:lang w:val="en-US"/>
+        </w:rPr>
+        <w:t>in NUMEX.</w:t>
       </w:r>
     </w:p>
     <w:p>
@@ -123,7 +135,13 @@
         <w:rPr>
           <w:lang w:val="en-US"/>
         </w:rPr>
-        <w:t xml:space="preserve">e traits and </w:t>
+        <w:t>e traits a</w:t>
+      </w:r>
+      <w:r>
+        <w:rPr>
+          <w:lang w:val="en-US"/>
+        </w:rPr>
+        <w:t xml:space="preserve">nd </w:t>
       </w:r>
       <w:proofErr w:type="spellStart"/>
       <w:r>
@@ -137,7 +155,7 @@
         <w:rPr>
           <w:lang w:val="en-US"/>
         </w:rPr>
-        <w:t xml:space="preserve"> relationship are scarce.</w:t>
+        <w:t xml:space="preserve"> relationship are scarce and not existing on tropical mountains. </w:t>
       </w:r>
     </w:p>
     <w:p>
@@ -163,8 +181,385 @@
         </w:rPr>
         <w:t xml:space="preserve">: </w:t>
       </w:r>
-      <w:bookmarkStart w:id="0" w:name="_GoBack"/>
-      <w:bookmarkEnd w:id="0"/>
+    </w:p>
+    <w:p>
+      <w:pPr>
+        <w:jc w:val="both"/>
+        <w:rPr>
+          <w:b/>
+          <w:lang w:val="en-US"/>
+        </w:rPr>
+      </w:pPr>
+      <w:r>
+        <w:rPr>
+          <w:lang w:val="en-US"/>
+        </w:rPr>
+        <w:t>Previous reports suggest an evidence on nutrient deposition increase traits associated with increased photosynthetic capacity (</w:t>
+      </w:r>
+      <w:proofErr w:type="spellStart"/>
+      <w:r>
+        <w:rPr>
+          <w:lang w:val="en-US"/>
+        </w:rPr>
+        <w:t>Homeier</w:t>
+      </w:r>
+      <w:proofErr w:type="spellEnd"/>
+      <w:r>
+        <w:rPr>
+          <w:lang w:val="en-US"/>
+        </w:rPr>
+        <w:t xml:space="preserve"> et al., 2012)</w:t>
+      </w:r>
+      <w:r>
+        <w:rPr>
+          <w:lang w:val="en-US"/>
+        </w:rPr>
+        <w:t xml:space="preserve"> especially in N-limited ecosystems (Huang et al., 2016). </w:t>
+      </w:r>
+      <w:r>
+        <w:rPr>
+          <w:lang w:val="en-US"/>
+        </w:rPr>
+        <w:t xml:space="preserve"> Given the scenario of atmospheric fertilization, it is interesting to use </w:t>
+      </w:r>
+      <w:proofErr w:type="spellStart"/>
+      <w:r>
+        <w:rPr>
+          <w:lang w:val="en-US"/>
+        </w:rPr>
+        <w:t>iWUE</w:t>
+      </w:r>
+      <w:proofErr w:type="spellEnd"/>
+      <w:r>
+        <w:rPr>
+          <w:lang w:val="en-US"/>
+        </w:rPr>
+        <w:t xml:space="preserve"> as a proxy to this </w:t>
+      </w:r>
+      <w:r>
+        <w:rPr>
+          <w:lang w:val="en-US"/>
+        </w:rPr>
+        <w:t xml:space="preserve">hypothesis and to evaluate the possible effects on N on </w:t>
+      </w:r>
+      <w:proofErr w:type="spellStart"/>
+      <w:r>
+        <w:rPr>
+          <w:lang w:val="en-US"/>
+        </w:rPr>
+        <w:t>iWUE</w:t>
+      </w:r>
+      <w:proofErr w:type="spellEnd"/>
+      <w:r>
+        <w:rPr>
+          <w:b/>
+          <w:lang w:val="en-US"/>
+        </w:rPr>
+        <w:t xml:space="preserve">.  </w:t>
+      </w:r>
+    </w:p>
+    <w:p>
+      <w:pPr>
+        <w:rPr>
+          <w:b/>
+          <w:lang w:val="en-US"/>
+        </w:rPr>
+      </w:pPr>
+      <w:r>
+        <w:rPr>
+          <w:b/>
+          <w:lang w:val="en-US"/>
+        </w:rPr>
+        <w:t>Research questions (clear and defensible)</w:t>
+      </w:r>
+    </w:p>
+    <w:p>
+      <w:pPr>
+        <w:jc w:val="both"/>
+        <w:rPr>
+          <w:b/>
+          <w:lang w:val="en-US"/>
+        </w:rPr>
+      </w:pPr>
+      <w:r>
+        <w:rPr>
+          <w:b/>
+          <w:lang w:val="en-US"/>
+        </w:rPr>
+        <w:t>RQ1. Does moderate nutrient addition affect intrinsic water-use efficiency (</w:t>
+      </w:r>
+      <w:proofErr w:type="spellStart"/>
+      <w:r>
+        <w:rPr>
+          <w:b/>
+          <w:lang w:val="en-US"/>
+        </w:rPr>
+        <w:t>iWUE</w:t>
+      </w:r>
+      <w:proofErr w:type="spellEnd"/>
+      <w:r>
+        <w:rPr>
+          <w:b/>
+          <w:lang w:val="en-US"/>
+        </w:rPr>
+        <w:t>) after 15 years</w:t>
+      </w:r>
+      <w:r>
+        <w:rPr>
+          <w:b/>
+          <w:lang w:val="en-US"/>
+        </w:rPr>
+        <w:t xml:space="preserve"> between treatments</w:t>
+      </w:r>
+      <w:r>
+        <w:rPr>
+          <w:b/>
+          <w:lang w:val="en-US"/>
+        </w:rPr>
+        <w:t>?</w:t>
+      </w:r>
+    </w:p>
+    <w:p>
+      <w:pPr>
+        <w:rPr>
+          <w:b/>
+          <w:lang w:val="en-US"/>
+        </w:rPr>
+      </w:pPr>
+      <w:r>
+        <w:rPr>
+          <w:b/>
+          <w:lang w:val="en-US"/>
+        </w:rPr>
+        <w:t xml:space="preserve">RQ3. </w:t>
+      </w:r>
+      <w:r>
+        <w:rPr>
+          <w:b/>
+          <w:lang w:val="en-US"/>
+        </w:rPr>
+        <w:t>What are the trend</w:t>
+      </w:r>
+      <w:r>
+        <w:rPr>
+          <w:b/>
+          <w:lang w:val="en-US"/>
+        </w:rPr>
+        <w:t xml:space="preserve">s for </w:t>
+      </w:r>
+      <w:proofErr w:type="spellStart"/>
+      <w:r>
+        <w:rPr>
+          <w:b/>
+          <w:lang w:val="en-US"/>
+        </w:rPr>
+        <w:t>iWUE</w:t>
+      </w:r>
+      <w:proofErr w:type="spellEnd"/>
+      <w:r>
+        <w:rPr>
+          <w:b/>
+          <w:lang w:val="en-US"/>
+        </w:rPr>
+        <w:t xml:space="preserve"> response to fertilization depend on elevation (proxy as nutrient limitation)?</w:t>
+      </w:r>
+      <w:r>
+        <w:rPr>
+          <w:b/>
+          <w:lang w:val="en-US"/>
+        </w:rPr>
+        <w:t xml:space="preserve"> Expectation is to see a bigger impact at 2000 </w:t>
+      </w:r>
+      <w:proofErr w:type="spellStart"/>
+      <w:proofErr w:type="gramStart"/>
+      <w:r>
+        <w:rPr>
+          <w:b/>
+          <w:lang w:val="en-US"/>
+        </w:rPr>
+        <w:t>asl</w:t>
+      </w:r>
+      <w:proofErr w:type="spellEnd"/>
+      <w:proofErr w:type="gramEnd"/>
+      <w:r>
+        <w:rPr>
+          <w:b/>
+          <w:lang w:val="en-US"/>
+        </w:rPr>
+        <w:t xml:space="preserve"> and 3000 </w:t>
+      </w:r>
+      <w:proofErr w:type="spellStart"/>
+      <w:r>
+        <w:rPr>
+          <w:b/>
+          <w:lang w:val="en-US"/>
+        </w:rPr>
+        <w:t>asl</w:t>
+      </w:r>
+      <w:proofErr w:type="spellEnd"/>
+      <w:r>
+        <w:rPr>
+          <w:b/>
+          <w:lang w:val="en-US"/>
+        </w:rPr>
+        <w:t xml:space="preserve">. </w:t>
+      </w:r>
+    </w:p>
+    <w:p>
+      <w:pPr>
+        <w:rPr>
+          <w:b/>
+          <w:lang w:val="en-US"/>
+        </w:rPr>
+      </w:pPr>
+      <w:r>
+        <w:rPr>
+          <w:b/>
+          <w:lang w:val="en-US"/>
+        </w:rPr>
+        <w:t xml:space="preserve">H1: </w:t>
+      </w:r>
+      <w:r>
+        <w:rPr>
+          <w:lang w:val="en-US"/>
+        </w:rPr>
+        <w:t xml:space="preserve">Moderate nutrient addition alters </w:t>
+      </w:r>
+      <w:proofErr w:type="spellStart"/>
+      <w:r>
+        <w:rPr>
+          <w:lang w:val="en-US"/>
+        </w:rPr>
+        <w:t>iWUE</w:t>
+      </w:r>
+      <w:proofErr w:type="spellEnd"/>
+      <w:r>
+        <w:rPr>
+          <w:lang w:val="en-US"/>
+        </w:rPr>
+        <w:t>, but the direction and magnitude of the response depend on nutrient limitation and environmental context.</w:t>
+      </w:r>
+    </w:p>
+    <w:p>
+      <w:pPr>
+        <w:rPr>
+          <w:b/>
+          <w:lang w:val="en-US"/>
+        </w:rPr>
+      </w:pPr>
+      <w:r>
+        <w:rPr>
+          <w:b/>
+          <w:lang w:val="en-US"/>
+        </w:rPr>
+        <w:t xml:space="preserve">H2: In high-elevation, N-limited environments, nitrogen addition increases photosynthetic capacity and biomass production, leading to changes in </w:t>
+      </w:r>
+      <w:proofErr w:type="spellStart"/>
+      <w:r>
+        <w:rPr>
+          <w:b/>
+          <w:lang w:val="en-US"/>
+        </w:rPr>
+        <w:t>iWUE</w:t>
+      </w:r>
+      <w:proofErr w:type="spellEnd"/>
+      <w:r>
+        <w:rPr>
+          <w:b/>
+          <w:lang w:val="en-US"/>
+        </w:rPr>
+        <w:t xml:space="preserve"> driven primarily by enhanced carbon assimilation.</w:t>
+      </w:r>
+      <w:r>
+        <w:rPr>
+          <w:b/>
+          <w:lang w:val="en-US"/>
+        </w:rPr>
+        <w:t xml:space="preserve"> </w:t>
+      </w:r>
+      <w:r>
+        <w:rPr>
+          <w:lang w:val="en-US"/>
+        </w:rPr>
+        <w:t xml:space="preserve">Baseline </w:t>
+      </w:r>
+      <w:proofErr w:type="spellStart"/>
+      <w:r>
+        <w:rPr>
+          <w:lang w:val="en-US"/>
+        </w:rPr>
+        <w:t>iWUE</w:t>
+      </w:r>
+      <w:proofErr w:type="spellEnd"/>
+      <w:r>
+        <w:rPr>
+          <w:lang w:val="en-US"/>
+        </w:rPr>
+        <w:t xml:space="preserve"> increases with elevation due to lower temperatures, reduced VPD, and </w:t>
+      </w:r>
+      <w:proofErr w:type="gramStart"/>
+      <w:r>
+        <w:rPr>
+          <w:lang w:val="en-US"/>
+        </w:rPr>
+        <w:t>more conservative stomatal regulation under colder conditions</w:t>
+      </w:r>
+      <w:proofErr w:type="gramEnd"/>
+      <w:r>
+        <w:rPr>
+          <w:lang w:val="en-US"/>
+        </w:rPr>
+        <w:t>.</w:t>
+      </w:r>
+      <w:r>
+        <w:rPr>
+          <w:lang w:val="en-US"/>
+        </w:rPr>
+        <w:t xml:space="preserve"> We will focus on </w:t>
+      </w:r>
+      <w:proofErr w:type="spellStart"/>
+      <w:r>
+        <w:rPr>
+          <w:lang w:val="en-US"/>
+        </w:rPr>
+        <w:t>Nmass</w:t>
+      </w:r>
+      <w:proofErr w:type="spellEnd"/>
+      <w:r>
+        <w:rPr>
+          <w:lang w:val="en-US"/>
+        </w:rPr>
+        <w:t>/</w:t>
+      </w:r>
+      <w:proofErr w:type="spellStart"/>
+      <w:r>
+        <w:rPr>
+          <w:lang w:val="en-US"/>
+        </w:rPr>
+        <w:t>Narea</w:t>
+      </w:r>
+      <w:proofErr w:type="spellEnd"/>
+      <w:r>
+        <w:rPr>
+          <w:lang w:val="en-US"/>
+        </w:rPr>
+        <w:t xml:space="preserve">, LMA/SLA. </w:t>
+      </w:r>
+    </w:p>
+    <w:p>
+      <w:pPr>
+        <w:rPr>
+          <w:b/>
+          <w:lang w:val="en-US"/>
+        </w:rPr>
+      </w:pPr>
+      <w:r>
+        <w:rPr>
+          <w:b/>
+          <w:lang w:val="en-US"/>
+        </w:rPr>
+        <w:t>Material and methods.</w:t>
+      </w:r>
     </w:p>
     <w:p>
       <w:pPr>
@@ -174,32 +569,14 @@
           <w:numId w:val="1"/>
         </w:numPr>
         <w:rPr>
-          <w:b/>
-          <w:lang w:val="en-US"/>
-        </w:rPr>
-      </w:pPr>
-      <w:r>
-        <w:rPr>
-          <w:b/>
-          <w:lang w:val="en-US"/>
-        </w:rPr>
-        <w:t xml:space="preserve">Increased N deposition can influence </w:t>
-      </w:r>
-      <w:proofErr w:type="spellStart"/>
-      <w:r>
-        <w:rPr>
-          <w:b/>
-          <w:lang w:val="en-US"/>
-        </w:rPr>
-        <w:t>iWUE</w:t>
-      </w:r>
-      <w:proofErr w:type="spellEnd"/>
-      <w:r>
-        <w:rPr>
-          <w:b/>
-          <w:lang w:val="en-US"/>
-        </w:rPr>
-        <w:t xml:space="preserve"> via increases in foliar [N) and photosynthetic capacity in N-limited ecosystems (Huang et al., 2016)</w:t>
+          <w:lang w:val="en-US"/>
+        </w:rPr>
+      </w:pPr>
+      <w:r>
+        <w:rPr>
+          <w:lang w:val="en-US"/>
+        </w:rPr>
+        <w:t>Site description.</w:t>
       </w:r>
     </w:p>
     <w:p>
@@ -210,31 +587,14 @@
           <w:numId w:val="1"/>
         </w:numPr>
         <w:rPr>
-          <w:b/>
-          <w:lang w:val="en-US"/>
-        </w:rPr>
-      </w:pPr>
-      <w:r>
-        <w:rPr>
-          <w:b/>
-          <w:lang w:val="en-US"/>
-        </w:rPr>
-        <w:t>Which ecosystems are N-Limited</w:t>
-      </w:r>
-    </w:p>
-    <w:p>
-      <w:pPr>
-        <w:rPr>
-          <w:b/>
-          <w:lang w:val="en-US"/>
-        </w:rPr>
-      </w:pPr>
-      <w:r>
-        <w:rPr>
-          <w:b/>
-          <w:lang w:val="en-US"/>
-        </w:rPr>
-        <w:t>Material and methods.</w:t>
+          <w:lang w:val="en-US"/>
+        </w:rPr>
+      </w:pPr>
+      <w:r>
+        <w:rPr>
+          <w:lang w:val="en-US"/>
+        </w:rPr>
+        <w:t>Experimental setup.</w:t>
       </w:r>
     </w:p>
     <w:p>
@@ -252,7 +612,7 @@
         <w:rPr>
           <w:lang w:val="en-US"/>
         </w:rPr>
-        <w:t>Site description.</w:t>
+        <w:t>Collection: functional traits + cellulose extraction – isotope measurement and nutrients (N).</w:t>
       </w:r>
     </w:p>
     <w:p>
@@ -270,42 +630,6 @@
         <w:rPr>
           <w:lang w:val="en-US"/>
         </w:rPr>
-        <w:t>Experimental setup.</w:t>
-      </w:r>
-    </w:p>
-    <w:p>
-      <w:pPr>
-        <w:pStyle w:val="Prrafodelista"/>
-        <w:numPr>
-          <w:ilvl w:val="0"/>
-          <w:numId w:val="1"/>
-        </w:numPr>
-        <w:rPr>
-          <w:lang w:val="en-US"/>
-        </w:rPr>
-      </w:pPr>
-      <w:r>
-        <w:rPr>
-          <w:lang w:val="en-US"/>
-        </w:rPr>
-        <w:t>Collection: functional traits + cellulose extraction – isotope measurement and nutrients (N).</w:t>
-      </w:r>
-    </w:p>
-    <w:p>
-      <w:pPr>
-        <w:pStyle w:val="Prrafodelista"/>
-        <w:numPr>
-          <w:ilvl w:val="0"/>
-          <w:numId w:val="1"/>
-        </w:numPr>
-        <w:rPr>
-          <w:lang w:val="en-US"/>
-        </w:rPr>
-      </w:pPr>
-      <w:r>
-        <w:rPr>
-          <w:lang w:val="en-US"/>
-        </w:rPr>
         <w:t>Calculations and statistical analysis.</w:t>
       </w:r>
     </w:p>
@@ -442,60 +766,8 @@
         </w:rPr>
         <w:t>Treatment effects on species at different elevations.</w:t>
       </w:r>
-    </w:p>
-    <w:p>
-      <w:pPr>
-        <w:rPr>
-          <w:b/>
-          <w:lang w:val="en-US"/>
-        </w:rPr>
-      </w:pPr>
-      <w:r>
-        <w:rPr>
-          <w:b/>
-          <w:lang w:val="en-US"/>
-        </w:rPr>
-        <w:t>Conclusion</w:t>
-      </w:r>
-    </w:p>
-    <w:p>
-      <w:pPr>
-        <w:pStyle w:val="Prrafodelista"/>
-        <w:numPr>
-          <w:ilvl w:val="0"/>
-          <w:numId w:val="1"/>
-        </w:numPr>
-        <w:rPr>
-          <w:lang w:val="en-US"/>
-        </w:rPr>
-      </w:pPr>
-      <w:r>
-        <w:rPr>
-          <w:lang w:val="en-US"/>
-        </w:rPr>
-        <w:t xml:space="preserve">Species dependent response. No </w:t>
-      </w:r>
-      <w:proofErr w:type="spellStart"/>
-      <w:r>
-        <w:rPr>
-          <w:lang w:val="en-US"/>
-        </w:rPr>
-        <w:t>iWUE</w:t>
-      </w:r>
-      <w:proofErr w:type="spellEnd"/>
-      <w:r>
-        <w:rPr>
-          <w:lang w:val="en-US"/>
-        </w:rPr>
-        <w:t xml:space="preserve"> response.</w:t>
-      </w:r>
-    </w:p>
-    <w:p>
-      <w:pPr>
-        <w:rPr>
-          <w:lang w:val="en-US"/>
-        </w:rPr>
-      </w:pPr>
+      <w:bookmarkStart w:id="0" w:name="_GoBack"/>
+      <w:bookmarkEnd w:id="0"/>
     </w:p>
     <w:sectPr>
       <w:pgSz w:w="12240" w:h="15840"/>

</xml_diff>

<commit_message>
installed python y unidades de Narea
</commit_message>
<xml_diff>
--- a/Outline.docx
+++ b/Outline.docx
@@ -57,7 +57,13 @@
         <w:rPr>
           <w:lang w:val="en-US"/>
         </w:rPr>
-        <w:t xml:space="preserve"> on tropical mountain forests interaction and influence on ecosystems function is scarce.</w:t>
+        <w:t xml:space="preserve"> on tropical mountain forests interaction and influence on ecosystems function </w:t>
+      </w:r>
+      <w:r>
+        <w:rPr>
+          <w:lang w:val="en-US"/>
+        </w:rPr>
+        <w:t>are scarce.</w:t>
       </w:r>
     </w:p>
     <w:p>
@@ -75,25 +81,7 @@
         <w:rPr>
           <w:lang w:val="en-US"/>
         </w:rPr>
-        <w:t>Bio</w:t>
-      </w:r>
-      <w:r>
-        <w:rPr>
-          <w:lang w:val="en-US"/>
-        </w:rPr>
-        <w:t>geochemistry on montane forests:</w:t>
-      </w:r>
-      <w:r>
-        <w:rPr>
-          <w:lang w:val="en-US"/>
-        </w:rPr>
-        <w:t xml:space="preserve"> N or P limitation </w:t>
-      </w:r>
-      <w:r>
-        <w:rPr>
-          <w:lang w:val="en-US"/>
-        </w:rPr>
-        <w:t>in NUMEX.</w:t>
+        <w:t xml:space="preserve">NUMEX is a long-term experiment established in 2009 with moderate fertilization addition. </w:t>
       </w:r>
     </w:p>
     <w:p>
@@ -111,7 +99,27 @@
         <w:rPr>
           <w:lang w:val="en-US"/>
         </w:rPr>
-        <w:t>Data on NUMEX previous reports and the year the experiment started.</w:t>
+        <w:t>Bio</w:t>
+      </w:r>
+      <w:r>
+        <w:rPr>
+          <w:lang w:val="en-US"/>
+        </w:rPr>
+        <w:t xml:space="preserve">geochemistry on montane forests. Particularly NUMEX seems to </w:t>
+      </w:r>
+      <w:proofErr w:type="gramStart"/>
+      <w:r>
+        <w:rPr>
+          <w:lang w:val="en-US"/>
+        </w:rPr>
+        <w:t>be co-limited</w:t>
+      </w:r>
+      <w:proofErr w:type="gramEnd"/>
+      <w:r>
+        <w:rPr>
+          <w:lang w:val="en-US"/>
+        </w:rPr>
+        <w:t xml:space="preserve"> by N and P nutrients. </w:t>
       </w:r>
     </w:p>
     <w:p>
@@ -129,19 +137,13 @@
         <w:rPr>
           <w:lang w:val="en-US"/>
         </w:rPr>
-        <w:t>Previous studies that have performed fertilization experiments to measur</w:t>
-      </w:r>
-      <w:r>
-        <w:rPr>
-          <w:lang w:val="en-US"/>
-        </w:rPr>
-        <w:t>e traits a</w:t>
-      </w:r>
-      <w:r>
-        <w:rPr>
-          <w:lang w:val="en-US"/>
-        </w:rPr>
-        <w:t xml:space="preserve">nd </w:t>
+        <w:t>Previous</w:t>
+      </w:r>
+      <w:r>
+        <w:rPr>
+          <w:lang w:val="en-US"/>
+        </w:rPr>
+        <w:t xml:space="preserve"> experiments on tropical mountains addressing </w:t>
       </w:r>
       <w:proofErr w:type="spellStart"/>
       <w:r>
@@ -155,7 +157,13 @@
         <w:rPr>
           <w:lang w:val="en-US"/>
         </w:rPr>
-        <w:t xml:space="preserve"> relationship are scarce and not existing on tropical mountains. </w:t>
+        <w:t xml:space="preserve"> </w:t>
+      </w:r>
+      <w:r>
+        <w:rPr>
+          <w:lang w:val="en-US"/>
+        </w:rPr>
+        <w:t xml:space="preserve">and the interaction with nutrient addition are scarce and limited to temperate forests. </w:t>
       </w:r>
     </w:p>
     <w:p>
@@ -184,8 +192,262 @@
     </w:p>
     <w:p>
       <w:pPr>
+        <w:rPr>
+          <w:b/>
+          <w:lang w:val="en-US"/>
+        </w:rPr>
+      </w:pPr>
+      <w:r>
+        <w:rPr>
+          <w:b/>
+          <w:lang w:val="en-US"/>
+        </w:rPr>
+        <w:t xml:space="preserve">Research questions </w:t>
+      </w:r>
+    </w:p>
+    <w:p>
+      <w:pPr>
+        <w:rPr>
+          <w:b/>
+          <w:lang w:val="en-US"/>
+        </w:rPr>
+      </w:pPr>
+      <w:r>
+        <w:rPr>
+          <w:b/>
+          <w:lang w:val="en-US"/>
+        </w:rPr>
+        <w:t>1. “How does moderate nutrient addition influence intrinsic water-use efficiency (</w:t>
+      </w:r>
+      <w:proofErr w:type="spellStart"/>
+      <w:r>
+        <w:rPr>
+          <w:b/>
+          <w:lang w:val="en-US"/>
+        </w:rPr>
+        <w:t>iWUE</w:t>
+      </w:r>
+      <w:proofErr w:type="spellEnd"/>
+      <w:r>
+        <w:rPr>
+          <w:b/>
+          <w:lang w:val="en-US"/>
+        </w:rPr>
+        <w:t>) across species along an altitudinal gradient, and what roles do leaf nutrient content (</w:t>
+      </w:r>
+      <w:proofErr w:type="spellStart"/>
+      <w:r>
+        <w:rPr>
+          <w:b/>
+          <w:lang w:val="en-US"/>
+        </w:rPr>
+        <w:t>Nmass</w:t>
+      </w:r>
+      <w:proofErr w:type="spellEnd"/>
+      <w:r>
+        <w:rPr>
+          <w:b/>
+          <w:lang w:val="en-US"/>
+        </w:rPr>
+        <w:t>/</w:t>
+      </w:r>
+      <w:proofErr w:type="spellStart"/>
+      <w:r>
+        <w:rPr>
+          <w:b/>
+          <w:lang w:val="en-US"/>
+        </w:rPr>
+        <w:t>Narea</w:t>
+      </w:r>
+      <w:proofErr w:type="spellEnd"/>
+      <w:r>
+        <w:rPr>
+          <w:b/>
+          <w:lang w:val="en-US"/>
+        </w:rPr>
+        <w:t>) and key leaf traits (LMA/SLA) play in mediating this response?”</w:t>
+      </w:r>
+    </w:p>
+    <w:p>
+      <w:pPr>
         <w:jc w:val="both"/>
         <w:rPr>
+          <w:i/>
+          <w:lang w:val="en-US"/>
+        </w:rPr>
+      </w:pPr>
+      <w:r>
+        <w:rPr>
+          <w:i/>
+          <w:lang w:val="en-US"/>
+        </w:rPr>
+        <w:t>RQ1. Does moderate nutrient addition affect intrinsic water-use efficiency (</w:t>
+      </w:r>
+      <w:proofErr w:type="spellStart"/>
+      <w:r>
+        <w:rPr>
+          <w:i/>
+          <w:lang w:val="en-US"/>
+        </w:rPr>
+        <w:t>iWUE</w:t>
+      </w:r>
+      <w:proofErr w:type="spellEnd"/>
+      <w:r>
+        <w:rPr>
+          <w:i/>
+          <w:lang w:val="en-US"/>
+        </w:rPr>
+        <w:t>) after 15 years</w:t>
+      </w:r>
+      <w:r>
+        <w:rPr>
+          <w:i/>
+          <w:lang w:val="en-US"/>
+        </w:rPr>
+        <w:t xml:space="preserve"> between treatments</w:t>
+      </w:r>
+      <w:r>
+        <w:rPr>
+          <w:i/>
+          <w:lang w:val="en-US"/>
+        </w:rPr>
+        <w:t>?</w:t>
+      </w:r>
+    </w:p>
+    <w:p>
+      <w:pPr>
+        <w:rPr>
+          <w:i/>
+          <w:lang w:val="en-US"/>
+        </w:rPr>
+      </w:pPr>
+      <w:r>
+        <w:rPr>
+          <w:i/>
+          <w:lang w:val="en-US"/>
+        </w:rPr>
+        <w:t>RQ2</w:t>
+      </w:r>
+      <w:r>
+        <w:rPr>
+          <w:i/>
+          <w:lang w:val="en-US"/>
+        </w:rPr>
+        <w:t xml:space="preserve">. </w:t>
+      </w:r>
+      <w:r>
+        <w:rPr>
+          <w:i/>
+          <w:lang w:val="en-US"/>
+        </w:rPr>
+        <w:t xml:space="preserve">What are the </w:t>
+      </w:r>
+      <w:r>
+        <w:rPr>
+          <w:i/>
+          <w:lang w:val="en-US"/>
+        </w:rPr>
+        <w:t>relations between leaf nutrients (</w:t>
+      </w:r>
+      <w:proofErr w:type="spellStart"/>
+      <w:r>
+        <w:rPr>
+          <w:i/>
+          <w:lang w:val="en-US"/>
+        </w:rPr>
+        <w:t>Nmass</w:t>
+      </w:r>
+      <w:proofErr w:type="spellEnd"/>
+      <w:r>
+        <w:rPr>
+          <w:i/>
+          <w:lang w:val="en-US"/>
+        </w:rPr>
+        <w:t>/</w:t>
+      </w:r>
+      <w:proofErr w:type="spellStart"/>
+      <w:r>
+        <w:rPr>
+          <w:i/>
+          <w:lang w:val="en-US"/>
+        </w:rPr>
+        <w:t>Narea</w:t>
+      </w:r>
+      <w:proofErr w:type="spellEnd"/>
+      <w:r>
+        <w:rPr>
+          <w:i/>
+          <w:lang w:val="en-US"/>
+        </w:rPr>
+        <w:t>) and key leaf traits (LMA/SLA)</w:t>
+      </w:r>
+      <w:r>
+        <w:rPr>
+          <w:i/>
+          <w:lang w:val="en-US"/>
+        </w:rPr>
+        <w:t xml:space="preserve"> to</w:t>
+      </w:r>
+      <w:r>
+        <w:rPr>
+          <w:i/>
+          <w:lang w:val="en-US"/>
+        </w:rPr>
+        <w:t xml:space="preserve"> </w:t>
+      </w:r>
+      <w:proofErr w:type="spellStart"/>
+      <w:r>
+        <w:rPr>
+          <w:i/>
+          <w:lang w:val="en-US"/>
+        </w:rPr>
+        <w:t>iWUE</w:t>
+      </w:r>
+      <w:proofErr w:type="spellEnd"/>
+      <w:r>
+        <w:rPr>
+          <w:i/>
+          <w:lang w:val="en-US"/>
+        </w:rPr>
+        <w:t xml:space="preserve"> response to fertilization</w:t>
+      </w:r>
+      <w:r>
+        <w:rPr>
+          <w:i/>
+          <w:lang w:val="en-US"/>
+        </w:rPr>
+        <w:t xml:space="preserve"> schemes in an altitudinal gradient</w:t>
+      </w:r>
+      <w:r>
+        <w:rPr>
+          <w:i/>
+          <w:lang w:val="en-US"/>
+        </w:rPr>
+        <w:t>?</w:t>
+      </w:r>
+    </w:p>
+    <w:p>
+      <w:pPr>
+        <w:rPr>
+          <w:i/>
+          <w:lang w:val="en-US"/>
+        </w:rPr>
+      </w:pPr>
+      <w:bookmarkStart w:id="0" w:name="_GoBack"/>
+      <w:bookmarkEnd w:id="0"/>
+    </w:p>
+    <w:p>
+      <w:pPr>
+        <w:rPr>
+          <w:i/>
+          <w:lang w:val="en-US"/>
+        </w:rPr>
+      </w:pPr>
+    </w:p>
+    <w:p>
+      <w:pPr>
+        <w:jc w:val="both"/>
+        <w:rPr>
           <w:b/>
           <w:lang w:val="en-US"/>
         </w:rPr>
@@ -261,37 +523,38 @@
     <w:p>
       <w:pPr>
         <w:rPr>
-          <w:b/>
-          <w:lang w:val="en-US"/>
-        </w:rPr>
-      </w:pPr>
-      <w:r>
-        <w:rPr>
-          <w:b/>
-          <w:lang w:val="en-US"/>
-        </w:rPr>
-        <w:t>Research questions (clear and defensible)</w:t>
-      </w:r>
-    </w:p>
-    <w:p>
-      <w:pPr>
-        <w:jc w:val="both"/>
-        <w:rPr>
-          <w:b/>
-          <w:lang w:val="en-US"/>
-        </w:rPr>
-      </w:pPr>
-      <w:r>
-        <w:rPr>
-          <w:b/>
-          <w:lang w:val="en-US"/>
-        </w:rPr>
-        <w:t>RQ1. Does moderate nutrient addition affect intrinsic water-use efficiency (</w:t>
-      </w:r>
-      <w:proofErr w:type="spellStart"/>
-      <w:r>
-        <w:rPr>
-          <w:b/>
+          <w:lang w:val="en-US"/>
+        </w:rPr>
+      </w:pPr>
+      <w:r>
+        <w:rPr>
+          <w:lang w:val="en-US"/>
+        </w:rPr>
+        <w:t xml:space="preserve">We </w:t>
+      </w:r>
+      <w:proofErr w:type="spellStart"/>
+      <w:r>
+        <w:rPr>
+          <w:lang w:val="en-US"/>
+        </w:rPr>
+        <w:t>hipotesize</w:t>
+      </w:r>
+      <w:proofErr w:type="spellEnd"/>
+      <w:r>
+        <w:rPr>
+          <w:lang w:val="en-US"/>
+        </w:rPr>
+        <w:t xml:space="preserve"> that moderate nutrient addition will increase</w:t>
+      </w:r>
+      <w:r>
+        <w:rPr>
+          <w:lang w:val="en-US"/>
+        </w:rPr>
+        <w:t xml:space="preserve"> </w:t>
+      </w:r>
+      <w:proofErr w:type="spellStart"/>
+      <w:r>
+        <w:rPr>
           <w:lang w:val="en-US"/>
         </w:rPr>
         <w:t>iWUE</w:t>
@@ -299,53 +562,71 @@
       <w:proofErr w:type="spellEnd"/>
       <w:r>
         <w:rPr>
-          <w:b/>
-          <w:lang w:val="en-US"/>
-        </w:rPr>
-        <w:t>) after 15 years</w:t>
-      </w:r>
-      <w:r>
-        <w:rPr>
-          <w:b/>
-          <w:lang w:val="en-US"/>
-        </w:rPr>
-        <w:t xml:space="preserve"> between treatments</w:t>
-      </w:r>
-      <w:r>
-        <w:rPr>
-          <w:b/>
-          <w:lang w:val="en-US"/>
-        </w:rPr>
-        <w:t>?</w:t>
-      </w:r>
-    </w:p>
-    <w:p>
-      <w:pPr>
-        <w:rPr>
-          <w:b/>
-          <w:lang w:val="en-US"/>
-        </w:rPr>
-      </w:pPr>
-      <w:r>
-        <w:rPr>
-          <w:b/>
-          <w:lang w:val="en-US"/>
-        </w:rPr>
-        <w:t xml:space="preserve">RQ3. </w:t>
-      </w:r>
-      <w:r>
-        <w:rPr>
-          <w:b/>
-          <w:lang w:val="en-US"/>
-        </w:rPr>
-        <w:t>What are the trend</w:t>
-      </w:r>
-      <w:r>
-        <w:rPr>
-          <w:b/>
-          <w:lang w:val="en-US"/>
-        </w:rPr>
-        <w:t xml:space="preserve">s for </w:t>
+          <w:lang w:val="en-US"/>
+        </w:rPr>
+        <w:t xml:space="preserve">, </w:t>
+      </w:r>
+      <w:proofErr w:type="gramStart"/>
+      <w:r>
+        <w:rPr>
+          <w:lang w:val="en-US"/>
+        </w:rPr>
+        <w:t>specially</w:t>
+      </w:r>
+      <w:proofErr w:type="gramEnd"/>
+      <w:r>
+        <w:rPr>
+          <w:lang w:val="en-US"/>
+        </w:rPr>
+        <w:t xml:space="preserve"> on those species that showed higher leaf N content. </w:t>
+      </w:r>
+      <w:r>
+        <w:rPr>
+          <w:b/>
+          <w:lang w:val="en-US"/>
+        </w:rPr>
+        <w:t xml:space="preserve">Expectation is to see a bigger impact at 2000 </w:t>
+      </w:r>
+      <w:proofErr w:type="spellStart"/>
+      <w:proofErr w:type="gramStart"/>
+      <w:r>
+        <w:rPr>
+          <w:b/>
+          <w:lang w:val="en-US"/>
+        </w:rPr>
+        <w:t>asl</w:t>
+      </w:r>
+      <w:proofErr w:type="spellEnd"/>
+      <w:proofErr w:type="gramEnd"/>
+      <w:r>
+        <w:rPr>
+          <w:b/>
+          <w:lang w:val="en-US"/>
+        </w:rPr>
+        <w:t xml:space="preserve"> and 3000 </w:t>
+      </w:r>
+      <w:proofErr w:type="spellStart"/>
+      <w:r>
+        <w:rPr>
+          <w:b/>
+          <w:lang w:val="en-US"/>
+        </w:rPr>
+        <w:t>asl</w:t>
+      </w:r>
+      <w:proofErr w:type="spellEnd"/>
+      <w:r>
+        <w:rPr>
+          <w:b/>
+          <w:lang w:val="en-US"/>
+        </w:rPr>
+        <w:t xml:space="preserve">. </w:t>
+      </w:r>
+      <w:r>
+        <w:rPr>
+          <w:b/>
+          <w:lang w:val="en-US"/>
+        </w:rPr>
+        <w:t xml:space="preserve"> In high-elevation, N-limited environments, nitrogen addition increases photosynthetic capacity and biomass production, leading to changes in </w:t>
       </w:r>
       <w:proofErr w:type="spellStart"/>
       <w:r>
@@ -361,204 +642,77 @@
           <w:b/>
           <w:lang w:val="en-US"/>
         </w:rPr>
-        <w:t xml:space="preserve"> response to fertilization depend on elevation (proxy as nutrient limitation)?</w:t>
-      </w:r>
-      <w:r>
-        <w:rPr>
-          <w:b/>
-          <w:lang w:val="en-US"/>
-        </w:rPr>
-        <w:t xml:space="preserve"> Expectation is to see a bigger impact at 2000 </w:t>
-      </w:r>
-      <w:proofErr w:type="spellStart"/>
+        <w:t xml:space="preserve"> driven primarily by enhanced carbon assimilation.</w:t>
+      </w:r>
+      <w:r>
+        <w:rPr>
+          <w:b/>
+          <w:lang w:val="en-US"/>
+        </w:rPr>
+        <w:t xml:space="preserve"> </w:t>
+      </w:r>
+      <w:r>
+        <w:rPr>
+          <w:lang w:val="en-US"/>
+        </w:rPr>
+        <w:t xml:space="preserve">Baseline </w:t>
+      </w:r>
+      <w:proofErr w:type="spellStart"/>
+      <w:r>
+        <w:rPr>
+          <w:lang w:val="en-US"/>
+        </w:rPr>
+        <w:t>iWUE</w:t>
+      </w:r>
+      <w:proofErr w:type="spellEnd"/>
+      <w:r>
+        <w:rPr>
+          <w:lang w:val="en-US"/>
+        </w:rPr>
+        <w:t xml:space="preserve"> increases with elevation due to lower temperatures, reduced VPD, and </w:t>
+      </w:r>
       <w:proofErr w:type="gramStart"/>
       <w:r>
         <w:rPr>
-          <w:b/>
-          <w:lang w:val="en-US"/>
-        </w:rPr>
-        <w:t>asl</w:t>
-      </w:r>
-      <w:proofErr w:type="spellEnd"/>
+          <w:lang w:val="en-US"/>
+        </w:rPr>
+        <w:t>more conservative stomatal regulation under colder conditions</w:t>
+      </w:r>
       <w:proofErr w:type="gramEnd"/>
       <w:r>
         <w:rPr>
-          <w:b/>
-          <w:lang w:val="en-US"/>
-        </w:rPr>
-        <w:t xml:space="preserve"> and 3000 </w:t>
-      </w:r>
-      <w:proofErr w:type="spellStart"/>
-      <w:r>
-        <w:rPr>
-          <w:b/>
-          <w:lang w:val="en-US"/>
-        </w:rPr>
-        <w:t>asl</w:t>
-      </w:r>
-      <w:proofErr w:type="spellEnd"/>
-      <w:r>
-        <w:rPr>
-          <w:b/>
-          <w:lang w:val="en-US"/>
-        </w:rPr>
-        <w:t xml:space="preserve">. </w:t>
-      </w:r>
-    </w:p>
-    <w:p>
-      <w:pPr>
-        <w:rPr>
-          <w:b/>
-          <w:lang w:val="en-US"/>
-        </w:rPr>
-      </w:pPr>
-      <w:r>
-        <w:rPr>
-          <w:b/>
-          <w:lang w:val="en-US"/>
-        </w:rPr>
-        <w:t xml:space="preserve">H1: </w:t>
-      </w:r>
-      <w:r>
-        <w:rPr>
-          <w:lang w:val="en-US"/>
-        </w:rPr>
-        <w:t xml:space="preserve">Moderate nutrient addition alters </w:t>
-      </w:r>
-      <w:proofErr w:type="spellStart"/>
-      <w:r>
-        <w:rPr>
-          <w:lang w:val="en-US"/>
-        </w:rPr>
-        <w:t>iWUE</w:t>
-      </w:r>
-      <w:proofErr w:type="spellEnd"/>
-      <w:r>
-        <w:rPr>
-          <w:lang w:val="en-US"/>
-        </w:rPr>
-        <w:t>, but the direction and magnitude of the response depend on nutrient limitation and environmental context.</w:t>
-      </w:r>
-    </w:p>
-    <w:p>
-      <w:pPr>
-        <w:rPr>
-          <w:b/>
-          <w:lang w:val="en-US"/>
-        </w:rPr>
-      </w:pPr>
-      <w:r>
-        <w:rPr>
-          <w:b/>
-          <w:lang w:val="en-US"/>
-        </w:rPr>
-        <w:t xml:space="preserve">H2: In high-elevation, N-limited environments, nitrogen addition increases photosynthetic capacity and biomass production, leading to changes in </w:t>
-      </w:r>
-      <w:proofErr w:type="spellStart"/>
-      <w:r>
-        <w:rPr>
-          <w:b/>
-          <w:lang w:val="en-US"/>
-        </w:rPr>
-        <w:t>iWUE</w:t>
-      </w:r>
-      <w:proofErr w:type="spellEnd"/>
-      <w:r>
-        <w:rPr>
-          <w:b/>
-          <w:lang w:val="en-US"/>
-        </w:rPr>
-        <w:t xml:space="preserve"> driven primarily by enhanced carbon assimilation.</w:t>
-      </w:r>
-      <w:r>
-        <w:rPr>
-          <w:b/>
+          <w:lang w:val="en-US"/>
+        </w:rPr>
+        <w:t>.</w:t>
+      </w:r>
+      <w:r>
+        <w:rPr>
           <w:lang w:val="en-US"/>
         </w:rPr>
         <w:t xml:space="preserve"> </w:t>
       </w:r>
-      <w:r>
-        <w:rPr>
-          <w:lang w:val="en-US"/>
-        </w:rPr>
-        <w:t xml:space="preserve">Baseline </w:t>
-      </w:r>
-      <w:proofErr w:type="spellStart"/>
-      <w:r>
-        <w:rPr>
-          <w:lang w:val="en-US"/>
-        </w:rPr>
-        <w:t>iWUE</w:t>
-      </w:r>
-      <w:proofErr w:type="spellEnd"/>
-      <w:r>
-        <w:rPr>
-          <w:lang w:val="en-US"/>
-        </w:rPr>
-        <w:t xml:space="preserve"> increases with elevation due to lower temperatures, reduced VPD, and </w:t>
-      </w:r>
-      <w:proofErr w:type="gramStart"/>
-      <w:r>
-        <w:rPr>
-          <w:lang w:val="en-US"/>
-        </w:rPr>
-        <w:t>more conservative stomatal regulation under colder conditions</w:t>
-      </w:r>
-      <w:proofErr w:type="gramEnd"/>
-      <w:r>
-        <w:rPr>
-          <w:lang w:val="en-US"/>
-        </w:rPr>
-        <w:t>.</w:t>
-      </w:r>
-      <w:r>
-        <w:rPr>
-          <w:lang w:val="en-US"/>
-        </w:rPr>
-        <w:t xml:space="preserve"> We will focus on </w:t>
-      </w:r>
-      <w:proofErr w:type="spellStart"/>
-      <w:r>
-        <w:rPr>
-          <w:lang w:val="en-US"/>
-        </w:rPr>
-        <w:t>Nmass</w:t>
-      </w:r>
-      <w:proofErr w:type="spellEnd"/>
-      <w:r>
-        <w:rPr>
-          <w:lang w:val="en-US"/>
-        </w:rPr>
-        <w:t>/</w:t>
-      </w:r>
-      <w:proofErr w:type="spellStart"/>
-      <w:r>
-        <w:rPr>
-          <w:lang w:val="en-US"/>
-        </w:rPr>
-        <w:t>Narea</w:t>
-      </w:r>
-      <w:proofErr w:type="spellEnd"/>
-      <w:r>
-        <w:rPr>
-          <w:lang w:val="en-US"/>
-        </w:rPr>
-        <w:t xml:space="preserve">, LMA/SLA. </w:t>
-      </w:r>
-    </w:p>
-    <w:p>
-      <w:pPr>
-        <w:rPr>
-          <w:b/>
-          <w:lang w:val="en-US"/>
-        </w:rPr>
-      </w:pPr>
-      <w:r>
-        <w:rPr>
-          <w:b/>
-          <w:lang w:val="en-US"/>
-        </w:rPr>
-        <w:t>Material and methods.</w:t>
+    </w:p>
+    <w:p>
+      <w:pPr>
+        <w:rPr>
+          <w:i/>
+          <w:lang w:val="en-US"/>
+        </w:rPr>
+      </w:pPr>
+    </w:p>
+    <w:p>
+      <w:pPr>
+        <w:rPr>
+          <w:b/>
+          <w:lang w:val="en-US"/>
+        </w:rPr>
+      </w:pPr>
+      <w:r>
+        <w:rPr>
+          <w:b/>
+          <w:lang w:val="en-US"/>
+        </w:rPr>
+        <w:t>Material and methods (Draft done)</w:t>
       </w:r>
     </w:p>
     <w:p>
@@ -630,22 +784,8 @@
         <w:rPr>
           <w:lang w:val="en-US"/>
         </w:rPr>
+        <w:lastRenderedPageBreak/>
         <w:t>Calculations and statistical analysis.</w:t>
-      </w:r>
-    </w:p>
-    <w:p>
-      <w:pPr>
-        <w:rPr>
-          <w:b/>
-          <w:lang w:val="en-US"/>
-        </w:rPr>
-      </w:pPr>
-      <w:r>
-        <w:rPr>
-          <w:b/>
-          <w:lang w:val="en-US"/>
-        </w:rPr>
-        <w:t>Results</w:t>
       </w:r>
     </w:p>
     <w:p>
@@ -764,10 +904,126 @@
         <w:rPr>
           <w:lang w:val="en-US"/>
         </w:rPr>
-        <w:t>Treatment effects on species at different elevations.</w:t>
-      </w:r>
-      <w:bookmarkStart w:id="0" w:name="_GoBack"/>
-      <w:bookmarkEnd w:id="0"/>
+        <w:t xml:space="preserve">Overview: Differences between </w:t>
+      </w:r>
+      <w:proofErr w:type="spellStart"/>
+      <w:r>
+        <w:rPr>
+          <w:lang w:val="en-US"/>
+        </w:rPr>
+        <w:t>iWUE</w:t>
+      </w:r>
+      <w:proofErr w:type="spellEnd"/>
+      <w:r>
+        <w:rPr>
+          <w:lang w:val="en-US"/>
+        </w:rPr>
+        <w:t xml:space="preserve"> per elevation, contrasting responses per species but no effect on the treatments. </w:t>
+      </w:r>
+    </w:p>
+    <w:p>
+      <w:pPr>
+        <w:pStyle w:val="Prrafodelista"/>
+        <w:numPr>
+          <w:ilvl w:val="0"/>
+          <w:numId w:val="3"/>
+        </w:numPr>
+        <w:rPr>
+          <w:lang w:val="en-US"/>
+        </w:rPr>
+      </w:pPr>
+      <w:r>
+        <w:rPr>
+          <w:lang w:val="en-US"/>
+        </w:rPr>
+        <w:t xml:space="preserve">Nutrient addition is not enough to see </w:t>
+      </w:r>
+      <w:proofErr w:type="spellStart"/>
+      <w:r>
+        <w:rPr>
+          <w:lang w:val="en-US"/>
+        </w:rPr>
+        <w:t>iWUE</w:t>
+      </w:r>
+      <w:proofErr w:type="spellEnd"/>
+      <w:r>
+        <w:rPr>
+          <w:lang w:val="en-US"/>
+        </w:rPr>
+        <w:t xml:space="preserve"> differences.</w:t>
+      </w:r>
+    </w:p>
+    <w:p>
+      <w:pPr>
+        <w:pStyle w:val="Prrafodelista"/>
+        <w:rPr>
+          <w:lang w:val="en-US"/>
+        </w:rPr>
+      </w:pPr>
+      <w:r>
+        <w:rPr>
+          <w:lang w:val="en-US"/>
+        </w:rPr>
+        <w:t>Time and species-specific responses. Ex. Some are sensitive and others are not to nutrient addition.</w:t>
+      </w:r>
+    </w:p>
+    <w:p>
+      <w:pPr>
+        <w:pStyle w:val="Prrafodelista"/>
+        <w:numPr>
+          <w:ilvl w:val="0"/>
+          <w:numId w:val="3"/>
+        </w:numPr>
+        <w:rPr>
+          <w:lang w:val="en-US"/>
+        </w:rPr>
+      </w:pPr>
+      <w:r>
+        <w:rPr>
+          <w:lang w:val="en-US"/>
+        </w:rPr>
+        <w:t xml:space="preserve">Foliar nutrients and </w:t>
+      </w:r>
+      <w:proofErr w:type="spellStart"/>
+      <w:r>
+        <w:rPr>
+          <w:lang w:val="en-US"/>
+        </w:rPr>
+        <w:t>iWUE</w:t>
+      </w:r>
+      <w:proofErr w:type="spellEnd"/>
+    </w:p>
+    <w:p>
+      <w:pPr>
+        <w:pStyle w:val="Prrafodelista"/>
+        <w:numPr>
+          <w:ilvl w:val="0"/>
+          <w:numId w:val="3"/>
+        </w:numPr>
+        <w:rPr>
+          <w:lang w:val="en-US"/>
+        </w:rPr>
+      </w:pPr>
+      <w:r>
+        <w:rPr>
+          <w:lang w:val="en-US"/>
+        </w:rPr>
+        <w:t xml:space="preserve">Functional traits and </w:t>
+      </w:r>
+      <w:proofErr w:type="spellStart"/>
+      <w:r>
+        <w:rPr>
+          <w:lang w:val="en-US"/>
+        </w:rPr>
+        <w:t>iWUE</w:t>
+      </w:r>
+      <w:proofErr w:type="spellEnd"/>
+      <w:r>
+        <w:rPr>
+          <w:lang w:val="en-US"/>
+        </w:rPr>
+        <w:t>.</w:t>
+      </w:r>
     </w:p>
     <w:sectPr>
       <w:pgSz w:w="12240" w:h="15840"/>

</xml_diff>

<commit_message>
correccion 2023 y 2024 y mantener ciertos traits
</commit_message>
<xml_diff>
--- a/Outline.docx
+++ b/Outline.docx
@@ -73,70 +73,29 @@
           <w:numId w:val="7"/>
         </w:numPr>
         <w:rPr>
-          <w:rFonts w:asciiTheme="majorHAnsi" w:hAnsiTheme="majorHAnsi" w:cstheme="majorHAnsi"/>
-          <w:sz w:val="20"/>
-        </w:rPr>
-      </w:pPr>
-      <w:r>
-        <w:rPr>
           <w:rStyle w:val="Textoennegrita"/>
           <w:rFonts w:asciiTheme="majorHAnsi" w:hAnsiTheme="majorHAnsi" w:cstheme="majorHAnsi"/>
-          <w:sz w:val="20"/>
-        </w:rPr>
-        <w:t>Intrinsic water-use efficiency (</w:t>
-      </w:r>
-      <w:proofErr w:type="spellStart"/>
+          <w:bCs w:val="0"/>
+          <w:sz w:val="20"/>
+        </w:rPr>
+      </w:pPr>
       <w:r>
         <w:rPr>
           <w:rStyle w:val="Textoennegrita"/>
           <w:rFonts w:asciiTheme="majorHAnsi" w:hAnsiTheme="majorHAnsi" w:cstheme="majorHAnsi"/>
-          <w:sz w:val="20"/>
-        </w:rPr>
-        <w:t>iWUE</w:t>
-      </w:r>
-      <w:proofErr w:type="spellEnd"/>
+          <w:bCs w:val="0"/>
+          <w:sz w:val="20"/>
+        </w:rPr>
+        <w:t>Nutrient de</w:t>
+      </w:r>
       <w:r>
         <w:rPr>
           <w:rStyle w:val="Textoennegrita"/>
           <w:rFonts w:asciiTheme="majorHAnsi" w:hAnsiTheme="majorHAnsi" w:cstheme="majorHAnsi"/>
-          <w:sz w:val="20"/>
-        </w:rPr>
-        <w:t>)</w:t>
-      </w:r>
-      <w:r>
-        <w:rPr>
-          <w:rFonts w:asciiTheme="majorHAnsi" w:hAnsiTheme="majorHAnsi" w:cstheme="majorHAnsi"/>
-          <w:sz w:val="20"/>
-        </w:rPr>
-        <w:t xml:space="preserve"> is a key physiological </w:t>
-      </w:r>
-      <w:r>
-        <w:rPr>
-          <w:rFonts w:asciiTheme="majorHAnsi" w:hAnsiTheme="majorHAnsi" w:cstheme="majorHAnsi"/>
-          <w:sz w:val="20"/>
-        </w:rPr>
-        <w:t>parameter that links</w:t>
-      </w:r>
-      <w:r>
-        <w:rPr>
-          <w:rFonts w:asciiTheme="majorHAnsi" w:hAnsiTheme="majorHAnsi" w:cstheme="majorHAnsi"/>
-          <w:sz w:val="20"/>
-        </w:rPr>
-        <w:t xml:space="preserve"> the carbon and water cycles</w:t>
-      </w:r>
-      <w:r>
-        <w:rPr>
-          <w:rFonts w:asciiTheme="majorHAnsi" w:hAnsiTheme="majorHAnsi" w:cstheme="majorHAnsi"/>
-          <w:sz w:val="20"/>
-        </w:rPr>
-        <w:t>. It reflects</w:t>
-      </w:r>
-      <w:r>
-        <w:rPr>
-          <w:rFonts w:asciiTheme="majorHAnsi" w:hAnsiTheme="majorHAnsi" w:cstheme="majorHAnsi"/>
-          <w:sz w:val="20"/>
-        </w:rPr>
-        <w:t xml:space="preserve"> how plants balance carbon assimilation with stomatal regulation of water loss.</w:t>
+          <w:bCs w:val="0"/>
+          <w:sz w:val="20"/>
+        </w:rPr>
+        <w:t>position in the tropics effects.</w:t>
       </w:r>
     </w:p>
     <w:p>
@@ -147,204 +106,70 @@
           <w:numId w:val="7"/>
         </w:numPr>
         <w:rPr>
+          <w:rFonts w:asciiTheme="majorHAnsi" w:hAnsiTheme="majorHAnsi" w:cstheme="majorHAnsi"/>
+          <w:sz w:val="20"/>
+        </w:rPr>
+      </w:pPr>
+      <w:r>
+        <w:rPr>
           <w:rStyle w:val="Textoennegrita"/>
           <w:rFonts w:asciiTheme="majorHAnsi" w:hAnsiTheme="majorHAnsi" w:cstheme="majorHAnsi"/>
-          <w:b w:val="0"/>
-          <w:bCs w:val="0"/>
-          <w:sz w:val="20"/>
-        </w:rPr>
-      </w:pPr>
+          <w:sz w:val="20"/>
+        </w:rPr>
+        <w:t>Intrinsic water-use efficiency (</w:t>
+      </w:r>
+      <w:proofErr w:type="spellStart"/>
       <w:r>
         <w:rPr>
           <w:rStyle w:val="Textoennegrita"/>
           <w:rFonts w:asciiTheme="majorHAnsi" w:hAnsiTheme="majorHAnsi" w:cstheme="majorHAnsi"/>
           <w:sz w:val="20"/>
         </w:rPr>
-        <w:t>Nutrient addition experiments as a tool for standardize and collect data</w:t>
-      </w:r>
+        <w:t>iWUE</w:t>
+      </w:r>
+      <w:proofErr w:type="spellEnd"/>
       <w:r>
         <w:rPr>
           <w:rStyle w:val="Textoennegrita"/>
           <w:rFonts w:asciiTheme="majorHAnsi" w:hAnsiTheme="majorHAnsi" w:cstheme="majorHAnsi"/>
-          <w:b w:val="0"/>
-          <w:sz w:val="20"/>
-        </w:rPr>
-        <w:t xml:space="preserve">: </w:t>
-      </w:r>
-    </w:p>
-    <w:p>
-      <w:pPr>
-        <w:pStyle w:val="NormalWeb"/>
-        <w:ind w:left="1080"/>
-        <w:rPr>
-          <w:rFonts w:asciiTheme="majorHAnsi" w:hAnsiTheme="majorHAnsi" w:cstheme="majorHAnsi"/>
-          <w:sz w:val="20"/>
-        </w:rPr>
-      </w:pPr>
-      <w:r>
-        <w:rPr>
-          <w:rStyle w:val="Textoennegrita"/>
-          <w:rFonts w:asciiTheme="majorHAnsi" w:hAnsiTheme="majorHAnsi" w:cstheme="majorHAnsi"/>
-          <w:b w:val="0"/>
-          <w:sz w:val="20"/>
-        </w:rPr>
-        <w:fldChar w:fldCharType="begin" w:fldLock="1"/>
-      </w:r>
-      <w:r>
-        <w:rPr>
-          <w:rStyle w:val="Textoennegrita"/>
-          <w:rFonts w:asciiTheme="majorHAnsi" w:hAnsiTheme="majorHAnsi" w:cstheme="majorHAnsi"/>
-          <w:b w:val="0"/>
-          <w:sz w:val="20"/>
-        </w:rPr>
-        <w:instrText>ADDIN CSL_CITATION {"citationItems":[{"id":"ITEM-1","itemData":{"DOI":"10.1002/ecm.1382","ISSN":"15577015","abstract":"I present a meta-analysis of plant responses to 48 nutrient addition experiments conducted with native species in naturally growing tropical forests, exclusive of mangrove forests. The added nutrients include nitrogen (N) in 36 experiments, phosphorus (P) in 33 experiments, calcium and potassium in one experiment each, and various mixtures of essential nutrients in the remaining experiments. I evaluate the hypotheses that nutrients limit tropical forest plants, nutrient limitation is stronger in successional than in old-growth forests, P but not N is limiting in lowland forests, and N is limiting in montane forests. Responses to the most complete nutrient mix used in each experiment were strong for plant functions that contribute to aboveground production (Hedges’ g averages 0.87) and nonsignificant for fine root biomass. Responses to N addition and to P addition were strong for tissue concentrations of the added element (Hedges’ g averages 0.75 and 1.4, respectively), moderate for fine litter production (0.64 and 0.65, respectively), moderate to weak for plant growth (0.46 and 0.37, respectively) and nonsignificant for fine root biomass. Growth responses were stronger in successional than in old-growth forests. All responses were unrelated to elevation. The 48 experiments included 30 factorial nitrogen-phosphorus experiments that enable additional direct tests of the widely cited hypotheses that P limitation is stronger than N limitation in lowland forests and vice versa in montane forests. Both hypotheses were rejected. The N × P interaction effect was nonsignificant across the factorial experiments. In conclusion, nutrients clearly limit tropical forest plants. Limitation by N is widespread in both lowland and montane forests, and the same is true for P. Single experiments identify limitation by calcium and potassium, and correlative studies suggest limitation by calcium, potassium, and magnesium. The available evidence is consistent with the possibility that most macronutrients limit tropical forest plants; however, experiments focus almost exclusively on N and P. The way forward will include taking fuller advantage of existing nutrient addition experiments, siting new experiments strategically, and developing cost-effective methods to assay responses to all of the essential nutrients soils supply to plants.","author":[{"dropping-particle":"","family":"Wright","given":"S. Joseph","non-dropping-particle":"","parse-names":false,"suffix":""}],"container-title":"Ecological Monographs","id":"ITEM-1","issue":"4","issued":{"date-parts":[["2019","11","1"]]},"publisher":"Ecological Society of America","title":"Plant responses to nutrient addition experiments conducted in tropical forests","type":"article-journal","volume":"89"},"uris":["http://www.mendeley.com/documents/?uuid=341a40b4-3a05-3f12-baa9-6d155595d103"]}],"mendeley":{"formattedCitation":"(Wright 2019)","plainTextFormattedCitation":"(Wright 2019)","previouslyFormattedCitation":"(Wright 2019)"},"properties":{"noteIndex":0},"schema":"https://github.com/citation-style-language/schema/raw/master/csl-citation.json"}</w:instrText>
-      </w:r>
-      <w:r>
-        <w:rPr>
-          <w:rStyle w:val="Textoennegrita"/>
-          <w:rFonts w:asciiTheme="majorHAnsi" w:hAnsiTheme="majorHAnsi" w:cstheme="majorHAnsi"/>
-          <w:b w:val="0"/>
-          <w:sz w:val="20"/>
-        </w:rPr>
-        <w:fldChar w:fldCharType="separate"/>
-      </w:r>
-      <w:r>
-        <w:rPr>
-          <w:rStyle w:val="Textoennegrita"/>
-          <w:rFonts w:asciiTheme="majorHAnsi" w:hAnsiTheme="majorHAnsi" w:cstheme="majorHAnsi"/>
-          <w:b w:val="0"/>
-          <w:noProof/>
-          <w:sz w:val="20"/>
-        </w:rPr>
-        <w:t>(Wright 2019)</w:t>
-      </w:r>
-      <w:r>
-        <w:rPr>
-          <w:rStyle w:val="Textoennegrita"/>
-          <w:rFonts w:asciiTheme="majorHAnsi" w:hAnsiTheme="majorHAnsi" w:cstheme="majorHAnsi"/>
-          <w:b w:val="0"/>
-          <w:sz w:val="20"/>
-        </w:rPr>
-        <w:fldChar w:fldCharType="end"/>
-      </w:r>
-      <w:r>
-        <w:rPr>
-          <w:rStyle w:val="Textoennegrita"/>
-          <w:rFonts w:asciiTheme="majorHAnsi" w:hAnsiTheme="majorHAnsi" w:cstheme="majorHAnsi"/>
-          <w:b w:val="0"/>
-          <w:sz w:val="20"/>
-        </w:rPr>
-        <w:t xml:space="preserve"> has an overview of tropical experiments. </w:t>
-      </w:r>
-      <w:r>
-        <w:rPr>
-          <w:rStyle w:val="Textoennegrita"/>
-          <w:rFonts w:asciiTheme="majorHAnsi" w:hAnsiTheme="majorHAnsi" w:cstheme="majorHAnsi"/>
-          <w:b w:val="0"/>
-          <w:sz w:val="20"/>
-        </w:rPr>
-        <w:fldChar w:fldCharType="begin" w:fldLock="1"/>
-      </w:r>
-      <w:r>
-        <w:rPr>
-          <w:rStyle w:val="Textoennegrita"/>
-          <w:rFonts w:asciiTheme="majorHAnsi" w:hAnsiTheme="majorHAnsi" w:cstheme="majorHAnsi"/>
-          <w:b w:val="0"/>
-          <w:sz w:val="20"/>
-        </w:rPr>
-        <w:instrText>ADDIN CSL_CITATION {"citationItems":[{"id":"ITEM-1","itemData":{"DOI":"10.1007/978-3-319-27422-5_13","abstract":"Highly productive tropical forests often occur on nutrient-poor soilsSoil\n        . The apparent lack of a relationship between tree growthTree growth\n         and site fertility has generated decades of research into which nutrients, if any, limit tropical forest...","author":[{"dropping-particle":"","family":"Sayer","given":"E. J.","non-dropping-particle":"","parse-names":false,"suffix":""},{"dropping-particle":"","family":"Banin","given":"L. F.","non-dropping-particle":"","parse-names":false,"suffix":""}],"container-title":"Tree Physiology","id":"ITEM-1","issued":{"date-parts":[["2016"]]},"page":"275-297","publisher":"Springer, Cham","title":"Tree Nutrient Status and Nutrient Cycling in Tropical Forest—Lessons from Fertilization Experiments","type":"article-journal","volume":"6"},"uris":["http://www.mendeley.com/documents/?uuid=f5f3f002-5b7b-3907-a413-51a195b1dce8"]}],"mendeley":{"formattedCitation":"(Sayer &amp; Banin 2016)","plainTextFormattedCitation":"(Sayer &amp; Banin 2016)","previouslyFormattedCitation":"(Sayer &amp; Banin 2016)"},"properties":{"noteIndex":0},"schema":"https://github.com/citation-style-language/schema/raw/master/csl-citation.json"}</w:instrText>
-      </w:r>
-      <w:r>
-        <w:rPr>
-          <w:rStyle w:val="Textoennegrita"/>
-          <w:rFonts w:asciiTheme="majorHAnsi" w:hAnsiTheme="majorHAnsi" w:cstheme="majorHAnsi"/>
-          <w:b w:val="0"/>
-          <w:sz w:val="20"/>
-        </w:rPr>
-        <w:fldChar w:fldCharType="separate"/>
-      </w:r>
-      <w:r>
-        <w:rPr>
-          <w:rStyle w:val="Textoennegrita"/>
-          <w:rFonts w:asciiTheme="majorHAnsi" w:hAnsiTheme="majorHAnsi" w:cstheme="majorHAnsi"/>
-          <w:b w:val="0"/>
-          <w:noProof/>
-          <w:sz w:val="20"/>
-        </w:rPr>
-        <w:t>(Sayer &amp; Banin 2016)</w:t>
-      </w:r>
-      <w:r>
-        <w:rPr>
-          <w:rStyle w:val="Textoennegrita"/>
-          <w:rFonts w:asciiTheme="majorHAnsi" w:hAnsiTheme="majorHAnsi" w:cstheme="majorHAnsi"/>
-          <w:b w:val="0"/>
-          <w:sz w:val="20"/>
-        </w:rPr>
-        <w:fldChar w:fldCharType="end"/>
-      </w:r>
-      <w:r>
-        <w:rPr>
-          <w:rStyle w:val="Textoennegrita"/>
-          <w:rFonts w:asciiTheme="majorHAnsi" w:hAnsiTheme="majorHAnsi" w:cstheme="majorHAnsi"/>
-          <w:b w:val="0"/>
-          <w:sz w:val="20"/>
-        </w:rPr>
-        <w:t xml:space="preserve"> Meta-analyzes of tropical mountains.</w:t>
-      </w:r>
-      <w:r>
-        <w:rPr>
-          <w:rStyle w:val="Textoennegrita"/>
-          <w:rFonts w:asciiTheme="majorHAnsi" w:hAnsiTheme="majorHAnsi" w:cstheme="majorHAnsi"/>
-          <w:b w:val="0"/>
-          <w:sz w:val="20"/>
-        </w:rPr>
-        <w:fldChar w:fldCharType="begin" w:fldLock="1"/>
-      </w:r>
-      <w:r>
-        <w:rPr>
-          <w:rStyle w:val="Textoennegrita"/>
-          <w:rFonts w:asciiTheme="majorHAnsi" w:hAnsiTheme="majorHAnsi" w:cstheme="majorHAnsi"/>
-          <w:b w:val="0"/>
-          <w:sz w:val="20"/>
-        </w:rPr>
-        <w:instrText>ADDIN CSL_CITATION {"citationItems":[{"id":"ITEM-1","itemData":{"DOI":"10.1017/S0266467415000619","ISSN":"14697831","abstract":"Tropical montane forests (TMF) are associated with a widely observed suite of characteristics encompassing forest structure, plant traits and biogeochemistry. With respect to nutrient relations, montane forests are characterized by slow decomposition of organic matter, high investment in below-ground biomass and poor litter quality, relative to tropical lowland forests. However, within TMF there is considerable variation in substrate age, parent material, disturbance and species composition. Here we emphasize that many TMFs are likely to be co-limited by multiple nutrients, and that feedback among soil properties, species traits, microbial communities and environmental conditions drive forest productivity and soil carbon storage. To date, studies of the biogeochemistry of montane forests have been restricted to a few, mostly neotropical, sites and focused mainly on trees while ignoring mycorrhizas, epiphytes and microbial community structure. Incorporating the geographic, environmental and biotic variability in TMF will lead to a greater recognition of plant-soil feedbacks that are critical to understanding constraints on productivity, both under present conditions and under future climate, nitrogen-deposition and land-use scenarios.","author":[{"dropping-particle":"","family":"Dalling","given":"James W.","non-dropping-particle":"","parse-names":false,"suffix":""},{"dropping-particle":"","family":"Heineman","given":"Katherine","non-dropping-particle":"","parse-names":false,"suffix":""},{"dropping-particle":"","family":"González","given":"Grizelle","non-dropping-particle":"","parse-names":false,"suffix":""},{"dropping-particle":"","family":"Ostertag","given":"Rebecca","non-dropping-particle":"","parse-names":false,"suffix":""}],"container-title":"Journal of Tropical Ecology","id":"ITEM-1","issue":"5","issued":{"date-parts":[["2016","9","1"]]},"page":"368-383","publisher":"Cambridge University Press","title":"Geographic, environmental and biotic sources of variation in the nutrient relations of tropical montane forests","type":"article-journal","volume":"32"},"uris":["http://www.mendeley.com/documents/?uuid=8c92cfc6-37d7-3593-aa4e-4bc85ccc58fc"]}],"mendeley":{"formattedCitation":"(Dalling et al. 2016)","plainTextFormattedCitation":"(Dalling et al. 2016)","previouslyFormattedCitation":"(Dalling et al. 2016)"},"properties":{"noteIndex":0},"schema":"https://github.com/citation-style-language/schema/raw/master/csl-citation.json"}</w:instrText>
-      </w:r>
-      <w:r>
-        <w:rPr>
-          <w:rStyle w:val="Textoennegrita"/>
-          <w:rFonts w:asciiTheme="majorHAnsi" w:hAnsiTheme="majorHAnsi" w:cstheme="majorHAnsi"/>
-          <w:b w:val="0"/>
-          <w:sz w:val="20"/>
-        </w:rPr>
-        <w:fldChar w:fldCharType="separate"/>
-      </w:r>
-      <w:r>
-        <w:rPr>
-          <w:rStyle w:val="Textoennegrita"/>
-          <w:rFonts w:asciiTheme="majorHAnsi" w:hAnsiTheme="majorHAnsi" w:cstheme="majorHAnsi"/>
-          <w:b w:val="0"/>
-          <w:noProof/>
-          <w:sz w:val="20"/>
-        </w:rPr>
-        <w:t>(Dalling et al. 2016)</w:t>
-      </w:r>
-      <w:r>
-        <w:rPr>
-          <w:rStyle w:val="Textoennegrita"/>
-          <w:rFonts w:asciiTheme="majorHAnsi" w:hAnsiTheme="majorHAnsi" w:cstheme="majorHAnsi"/>
-          <w:b w:val="0"/>
-          <w:sz w:val="20"/>
-        </w:rPr>
-        <w:fldChar w:fldCharType="end"/>
-      </w:r>
-      <w:r>
-        <w:rPr>
-          <w:rStyle w:val="Textoennegrita"/>
-          <w:rFonts w:asciiTheme="majorHAnsi" w:hAnsiTheme="majorHAnsi" w:cstheme="majorHAnsi"/>
-          <w:b w:val="0"/>
-          <w:sz w:val="20"/>
-        </w:rPr>
-        <w:t xml:space="preserve"> also an overview on nutrients on mountain forests.</w:t>
+          <w:sz w:val="20"/>
+        </w:rPr>
+        <w:t>)</w:t>
+      </w:r>
+      <w:r>
+        <w:rPr>
+          <w:rFonts w:asciiTheme="majorHAnsi" w:hAnsiTheme="majorHAnsi" w:cstheme="majorHAnsi"/>
+          <w:sz w:val="20"/>
+        </w:rPr>
+        <w:t xml:space="preserve"> is a key physiological </w:t>
+      </w:r>
+      <w:r>
+        <w:rPr>
+          <w:rFonts w:asciiTheme="majorHAnsi" w:hAnsiTheme="majorHAnsi" w:cstheme="majorHAnsi"/>
+          <w:sz w:val="20"/>
+        </w:rPr>
+        <w:t>parameter that links</w:t>
+      </w:r>
+      <w:r>
+        <w:rPr>
+          <w:rFonts w:asciiTheme="majorHAnsi" w:hAnsiTheme="majorHAnsi" w:cstheme="majorHAnsi"/>
+          <w:sz w:val="20"/>
+        </w:rPr>
+        <w:t xml:space="preserve"> the carbon and water cycles</w:t>
+      </w:r>
+      <w:r>
+        <w:rPr>
+          <w:rFonts w:asciiTheme="majorHAnsi" w:hAnsiTheme="majorHAnsi" w:cstheme="majorHAnsi"/>
+          <w:sz w:val="20"/>
+        </w:rPr>
+        <w:t>. It reflects</w:t>
+      </w:r>
+      <w:r>
+        <w:rPr>
+          <w:rFonts w:asciiTheme="majorHAnsi" w:hAnsiTheme="majorHAnsi" w:cstheme="majorHAnsi"/>
+          <w:sz w:val="20"/>
+        </w:rPr>
+        <w:t xml:space="preserve"> how plants balance carbon assimilation with stomatal regulation of water loss.</w:t>
       </w:r>
     </w:p>
     <w:p>
@@ -355,39 +180,29 @@
           <w:numId w:val="7"/>
         </w:numPr>
         <w:rPr>
-          <w:rFonts w:asciiTheme="majorHAnsi" w:hAnsiTheme="majorHAnsi" w:cstheme="majorHAnsi"/>
-          <w:sz w:val="20"/>
-        </w:rPr>
-      </w:pPr>
-      <w:r>
-        <w:rPr>
           <w:rStyle w:val="Textoennegrita"/>
           <w:rFonts w:asciiTheme="majorHAnsi" w:hAnsiTheme="majorHAnsi" w:cstheme="majorHAnsi"/>
-          <w:sz w:val="20"/>
-        </w:rPr>
-        <w:t>NUMEX</w:t>
-      </w:r>
-      <w:r>
-        <w:rPr>
-          <w:rFonts w:asciiTheme="majorHAnsi" w:hAnsiTheme="majorHAnsi" w:cstheme="majorHAnsi"/>
-          <w:sz w:val="20"/>
-        </w:rPr>
-        <w:t xml:space="preserve"> is a long-term nutrient manipulation experiment established in </w:t>
-      </w:r>
+          <w:b w:val="0"/>
+          <w:bCs w:val="0"/>
+          <w:sz w:val="20"/>
+        </w:rPr>
+      </w:pPr>
       <w:r>
         <w:rPr>
           <w:rStyle w:val="Textoennegrita"/>
           <w:rFonts w:asciiTheme="majorHAnsi" w:hAnsiTheme="majorHAnsi" w:cstheme="majorHAnsi"/>
           <w:sz w:val="20"/>
         </w:rPr>
-        <w:t>2009</w:t>
-      </w:r>
-      <w:r>
-        <w:rPr>
-          <w:rFonts w:asciiTheme="majorHAnsi" w:hAnsiTheme="majorHAnsi" w:cstheme="majorHAnsi"/>
-          <w:sz w:val="20"/>
-        </w:rPr>
-        <w:t xml:space="preserve"> in a tropical montane forest, designed to evaluate ecosystem responses to sustained, moderate additions of nitrogen (N) and phosphorus (P).</w:t>
+        <w:t>Nutrient addition experiments as a tool for standardize and collect data</w:t>
+      </w:r>
+      <w:r>
+        <w:rPr>
+          <w:rStyle w:val="Textoennegrita"/>
+          <w:rFonts w:asciiTheme="majorHAnsi" w:hAnsiTheme="majorHAnsi" w:cstheme="majorHAnsi"/>
+          <w:b w:val="0"/>
+          <w:sz w:val="20"/>
+        </w:rPr>
+        <w:t xml:space="preserve">: </w:t>
       </w:r>
     </w:p>
     <w:p>
@@ -401,53 +216,168 @@
       </w:pPr>
       <w:r>
         <w:rPr>
-          <w:rFonts w:asciiTheme="majorHAnsi" w:hAnsiTheme="majorHAnsi" w:cstheme="majorHAnsi"/>
-          <w:sz w:val="20"/>
-        </w:rPr>
-        <w:t xml:space="preserve"> Use </w:t>
-      </w:r>
-      <w:r>
-        <w:rPr>
-          <w:rFonts w:asciiTheme="majorHAnsi" w:hAnsiTheme="majorHAnsi" w:cstheme="majorHAnsi"/>
+          <w:rStyle w:val="Textoennegrita"/>
+          <w:rFonts w:asciiTheme="majorHAnsi" w:hAnsiTheme="majorHAnsi" w:cstheme="majorHAnsi"/>
+          <w:b w:val="0"/>
           <w:sz w:val="20"/>
         </w:rPr>
         <w:fldChar w:fldCharType="begin" w:fldLock="1"/>
       </w:r>
       <w:r>
         <w:rPr>
-          <w:rFonts w:asciiTheme="majorHAnsi" w:hAnsiTheme="majorHAnsi" w:cstheme="majorHAnsi"/>
-          <w:sz w:val="20"/>
-        </w:rPr>
-        <w:instrText>ADDIN CSL_CITATION {"citationItems":[{"id":"ITEM-1","itemData":{"DOI":"10.1371/JOURNAL.PONE.0047128","ISSN":"19326203","PMID":"23071734","abstract":"Tropical regions are facing increasing atmospheric inputs of nutrients, which will have unknown consequences for the structure and functioning of these systems. Here, we show that Neotropical montane rainforests respond rapidly to moderate additions of N (50 kg ha-1 yr-1) and P (10 kg ha-1 yr-1). Monitoring of nutrient fluxes demonstrated that the majority of added nutrients remained in the system, in either soil or vegetation. N and P additions led to not only an increase in foliar N and P concentrations, but also altered soil microbial biomass, standing fine root biomass, stem growth, and litterfall. The different effects suggest that trees are primarily limited by P, whereas some processes-notably aboveground productivity-are limited by both N and P. Highly variable and partly contrasting responses of different tree species suggest marked changes in species composition and diversity of these forests by nutrient inputs in the long term. The unexpectedly fast response of the ecosystem to moderate nutrient additions suggests high vulnerability of tropical montane forests to the expected increase in nutrient inputs. © 2012 Homeier et al.","author":[{"dropping-particle":"","family":"Homeier","given":"Jürgen","non-dropping-particle":"","parse-names":false,"suffix":""},{"dropping-particle":"","family":"Hertel","given":"Dietrich","non-dropping-particle":"","parse-names":false,"suffix":""},{"dropping-particle":"","family":"Camenzind","given":"Tessa","non-dropping-particle":"","parse-names":false,"suffix":""},{"dropping-particle":"","family":"Cumbicus","given":"Nixon L.","non-dropping-particle":"","parse-names":false,"suffix":""},{"dropping-particle":"","family":"Maraun","given":"Mark","non-dropping-particle":"","parse-names":false,"suffix":""},{"dropping-particle":"","family":"Martinson","given":"Guntars O.","non-dropping-particle":"","parse-names":false,"suffix":""},{"dropping-particle":"","family":"Poma","given":"L. Nohemy","non-dropping-particle":"","parse-names":false,"suffix":""},{"dropping-particle":"","family":"Rillig","given":"Matthias C.","non-dropping-particle":"","parse-names":false,"suffix":""},{"dropping-particle":"","family":"Sandmann","given":"Dorothee","non-dropping-particle":"","parse-names":false,"suffix":""},{"dropping-particle":"","family":"Scheu","given":"Stefan","non-dropping-particle":"","parse-names":false,"suffix":""},{"dropping-particle":"","family":"Veldkamp","given":"Edzo","non-dropping-particle":"","parse-names":false,"suffix":""},{"dropping-particle":"","family":"Wilcke","given":"Wolfgang","non-dropping-particle":"","parse-names":false,"suffix":""},{"dropping-particle":"","family":"Wullaert","given":"Hans","non-dropping-particle":"","parse-names":false,"suffix":""},{"dropping-particle":"","family":"Leuschner","given":"Christoph","non-dropping-particle":"","parse-names":false,"suffix":""}],"container-title":"PLoS ONE","id":"ITEM-1","issue":"10","issued":{"date-parts":[["2012","10","10"]]},"page":"e47128","title":"Tropical Andean Forests Are Highly Susceptible to Nutrient Inputs—Rapid Effects of Experimental N and P Addition to an Ecuadorian Montane Forest","type":"article-journal","volume":"7"},"uris":["http://www.mendeley.com/documents/?uuid=27a9dcaf-0fa1-3c69-a1d3-90c4b9e1aa5c"]},{"id":"ITEM-2","itemData":{"DOI":"10.1111/btp.12518","ISSN":"17447429","abstract":"Global changes in nutrient deposition rates are likely to have profound effects on plant communities, particularly in the nutrient-limited systems of the tropics. We studied the effects of increased nutrient availability on the seedlings of six tree species in montane forests of southern Ecuador in situ. After five years of continued N, P, or N+P addition, naturally grown seedlings of each of the two most common species at each elevation (1000, 2000, and 3000 m asl) were harvested for analyses of leaf morphology, nutrient content, herbivory, and tissue biomass allocation. Most species showed increased foliar N and P concentrations after addition of each respective element. Leaf tissue N:P ratios of &gt;20 in the control plants of all species suggest that P is more growth-limiting in these forests than N. Leaf morphological responses to nutrient addition were species and nutrient specific, with some species (Hedyosmum purparescens, Graffenrieda emarginata) exhibiting increased specific leaf area (SLA), and others (Graffenrieda harlingii) increased leaf area ratios (LAR). Pouteria torta (1000 m) had lower SLA and LAR after P addition. Increased herbivory was only evident in G. emarginata (after N and N+P addition). Only the species from 3000 m asl modified biomass allocation after nutrient addition. In general, N and N+P addition more strongly affected the species studied at the upper elevations, whereas P addition had a similar range of effects on the species at all elevations. We conclude that the responses of the studied tropical montane forest tree seedlings to chronic N and P addition are highly species-specific and that successful adaptation to increased nutrient availability will depend on species-specific morphological and physiological plasticity.","author":[{"dropping-particle":"","family":"Cárate-Tandalla","given":"Daisy","non-dropping-particle":"","parse-names":false,"suffix":""},{"dropping-particle":"","family":"Camenzind","given":"Tessa","non-dropping-particle":"","parse-names":false,"suffix":""},{"dropping-particle":"","family":"Leuschner","given":"Christoph","non-dropping-particle":"","parse-names":false,"suffix":""},{"dropping-particle":"","family":"Homeier","given":"Jürgen","non-dropping-particle":"","parse-names":false,"suffix":""}],"container-title":"Biotropica","id":"ITEM-2","issue":"2","issued":{"date-parts":[["2018","3","1"]]},"page":"234-245","publisher":"Blackwell Publishing Ltd","title":"Contrasting species responses to continued nitrogen and phosphorus addition in tropical montane forest tree seedlings","type":"article-journal","volume":"50"},"uris":["http://www.mendeley.com/documents/?uuid=e18483b0-e8bf-3e51-a4ca-5661cac205b0"]}],"mendeley":{"formattedCitation":"(Homeier et al. 2012; Cárate-Tandalla et al. 2018a)","plainTextFormattedCitation":"(Homeier et al. 2012; Cárate-Tandalla et al. 2018a)","previouslyFormattedCitation":"(Homeier et al. 2012; Cárate-Tandalla et al. 2018a)"},"properties":{"noteIndex":0},"schema":"https://github.com/citation-style-language/schema/raw/master/csl-citation.json"}</w:instrText>
-      </w:r>
-      <w:r>
-        <w:rPr>
-          <w:rFonts w:asciiTheme="majorHAnsi" w:hAnsiTheme="majorHAnsi" w:cstheme="majorHAnsi"/>
+          <w:rStyle w:val="Textoennegrita"/>
+          <w:rFonts w:asciiTheme="majorHAnsi" w:hAnsiTheme="majorHAnsi" w:cstheme="majorHAnsi"/>
+          <w:b w:val="0"/>
+          <w:sz w:val="20"/>
+        </w:rPr>
+        <w:instrText>ADDIN CSL_CITATION {"citationItems":[{"id":"ITEM-1","itemData":{"DOI":"10.1002/ecm.1382","ISSN":"15577015","abstract":"I present a meta-analysis of plant responses to 48 nutrient addition experiments conducted with native species in naturally growing tropical forests, exclusive of mangrove forests. The added nutrients include nitrogen (N) in 36 experiments, phosphorus (P) in 33 experiments, calcium and potassium in one experiment each, and various mixtures of essential nutrients in the remaining experiments. I evaluate the hypotheses that nutrients limit tropical forest plants, nutrient limitation is stronger in successional than in old-growth forests, P but not N is limiting in lowland forests, and N is limiting in montane forests. Responses to the most complete nutrient mix used in each experiment were strong for plant functions that contribute to aboveground production (Hedges’ g averages 0.87) and nonsignificant for fine root biomass. Responses to N addition and to P addition were strong for tissue concentrations of the added element (Hedges’ g averages 0.75 and 1.4, respectively), moderate for fine litter production (0.64 and 0.65, respectively), moderate to weak for plant growth (0.46 and 0.37, respectively) and nonsignificant for fine root biomass. Growth responses were stronger in successional than in old-growth forests. All responses were unrelated to elevation. The 48 experiments included 30 factorial nitrogen-phosphorus experiments that enable additional direct tests of the widely cited hypotheses that P limitation is stronger than N limitation in lowland forests and vice versa in montane forests. Both hypotheses were rejected. The N × P interaction effect was nonsignificant across the factorial experiments. In conclusion, nutrients clearly limit tropical forest plants. Limitation by N is widespread in both lowland and montane forests, and the same is true for P. Single experiments identify limitation by calcium and potassium, and correlative studies suggest limitation by calcium, potassium, and magnesium. The available evidence is consistent with the possibility that most macronutrients limit tropical forest plants; however, experiments focus almost exclusively on N and P. The way forward will include taking fuller advantage of existing nutrient addition experiments, siting new experiments strategically, and developing cost-effective methods to assay responses to all of the essential nutrients soils supply to plants.","author":[{"dropping-particle":"","family":"Wright","given":"S. Joseph","non-dropping-particle":"","parse-names":false,"suffix":""}],"container-title":"Ecological Monographs","id":"ITEM-1","issue":"4","issued":{"date-parts":[["2019","11","1"]]},"publisher":"Ecological Society of America","title":"Plant responses to nutrient addition experiments conducted in tropical forests","type":"article-journal","volume":"89"},"uris":["http://www.mendeley.com/documents/?uuid=341a40b4-3a05-3f12-baa9-6d155595d103"]}],"mendeley":{"formattedCitation":"(Wright 2019)","plainTextFormattedCitation":"(Wright 2019)","previouslyFormattedCitation":"(Wright 2019)"},"properties":{"noteIndex":0},"schema":"https://github.com/citation-style-language/schema/raw/master/csl-citation.json"}</w:instrText>
+      </w:r>
+      <w:r>
+        <w:rPr>
+          <w:rStyle w:val="Textoennegrita"/>
+          <w:rFonts w:asciiTheme="majorHAnsi" w:hAnsiTheme="majorHAnsi" w:cstheme="majorHAnsi"/>
+          <w:b w:val="0"/>
           <w:sz w:val="20"/>
         </w:rPr>
         <w:fldChar w:fldCharType="separate"/>
       </w:r>
       <w:r>
         <w:rPr>
-          <w:rFonts w:asciiTheme="majorHAnsi" w:hAnsiTheme="majorHAnsi" w:cstheme="majorHAnsi"/>
+          <w:rStyle w:val="Textoennegrita"/>
+          <w:rFonts w:asciiTheme="majorHAnsi" w:hAnsiTheme="majorHAnsi" w:cstheme="majorHAnsi"/>
+          <w:b w:val="0"/>
           <w:noProof/>
           <w:sz w:val="20"/>
         </w:rPr>
-        <w:t>(Homeier et al. 2012; Cárate-Tandalla et al. 2018a)</w:t>
-      </w:r>
-      <w:r>
-        <w:rPr>
-          <w:rFonts w:asciiTheme="majorHAnsi" w:hAnsiTheme="majorHAnsi" w:cstheme="majorHAnsi"/>
+        <w:t>(Wright 2019)</w:t>
+      </w:r>
+      <w:r>
+        <w:rPr>
+          <w:rStyle w:val="Textoennegrita"/>
+          <w:rFonts w:asciiTheme="majorHAnsi" w:hAnsiTheme="majorHAnsi" w:cstheme="majorHAnsi"/>
+          <w:b w:val="0"/>
           <w:sz w:val="20"/>
         </w:rPr>
         <w:fldChar w:fldCharType="end"/>
       </w:r>
       <w:r>
         <w:rPr>
-          <w:rFonts w:asciiTheme="majorHAnsi" w:hAnsiTheme="majorHAnsi" w:cstheme="majorHAnsi"/>
-          <w:sz w:val="20"/>
-        </w:rPr>
-        <w:t xml:space="preserve"> for references on the experiment. </w:t>
+          <w:rStyle w:val="Textoennegrita"/>
+          <w:rFonts w:asciiTheme="majorHAnsi" w:hAnsiTheme="majorHAnsi" w:cstheme="majorHAnsi"/>
+          <w:b w:val="0"/>
+          <w:sz w:val="20"/>
+        </w:rPr>
+        <w:t xml:space="preserve"> has an overview of tropical experiments. </w:t>
+      </w:r>
+      <w:r>
+        <w:rPr>
+          <w:rStyle w:val="Textoennegrita"/>
+          <w:rFonts w:asciiTheme="majorHAnsi" w:hAnsiTheme="majorHAnsi" w:cstheme="majorHAnsi"/>
+          <w:b w:val="0"/>
+          <w:sz w:val="20"/>
+        </w:rPr>
+        <w:fldChar w:fldCharType="begin" w:fldLock="1"/>
+      </w:r>
+      <w:r>
+        <w:rPr>
+          <w:rStyle w:val="Textoennegrita"/>
+          <w:rFonts w:asciiTheme="majorHAnsi" w:hAnsiTheme="majorHAnsi" w:cstheme="majorHAnsi"/>
+          <w:b w:val="0"/>
+          <w:sz w:val="20"/>
+        </w:rPr>
+        <w:instrText>ADDIN CSL_CITATION {"citationItems":[{"id":"ITEM-1","itemData":{"DOI":"10.1007/978-3-319-27422-5_13","abstract":"Highly productive tropical forests often occur on nutrient-poor soilsSoil\n        . The apparent lack of a relationship between tree growthTree growth\n         and site fertility has generated decades of research into which nutrients, if any, limit tropical forest...","author":[{"dropping-particle":"","family":"Sayer","given":"E. J.","non-dropping-particle":"","parse-names":false,"suffix":""},{"dropping-particle":"","family":"Banin","given":"L. F.","non-dropping-particle":"","parse-names":false,"suffix":""}],"container-title":"Tree Physiology","id":"ITEM-1","issued":{"date-parts":[["2016"]]},"page":"275-297","publisher":"Springer, Cham","title":"Tree Nutrient Status and Nutrient Cycling in Tropical Forest—Lessons from Fertilization Experiments","type":"article-journal","volume":"6"},"uris":["http://www.mendeley.com/documents/?uuid=f5f3f002-5b7b-3907-a413-51a195b1dce8"]}],"mendeley":{"formattedCitation":"(Sayer &amp; Banin 2016)","plainTextFormattedCitation":"(Sayer &amp; Banin 2016)","previouslyFormattedCitation":"(Sayer &amp; Banin 2016)"},"properties":{"noteIndex":0},"schema":"https://github.com/citation-style-language/schema/raw/master/csl-citation.json"}</w:instrText>
+      </w:r>
+      <w:r>
+        <w:rPr>
+          <w:rStyle w:val="Textoennegrita"/>
+          <w:rFonts w:asciiTheme="majorHAnsi" w:hAnsiTheme="majorHAnsi" w:cstheme="majorHAnsi"/>
+          <w:b w:val="0"/>
+          <w:sz w:val="20"/>
+        </w:rPr>
+        <w:fldChar w:fldCharType="separate"/>
+      </w:r>
+      <w:r>
+        <w:rPr>
+          <w:rStyle w:val="Textoennegrita"/>
+          <w:rFonts w:asciiTheme="majorHAnsi" w:hAnsiTheme="majorHAnsi" w:cstheme="majorHAnsi"/>
+          <w:b w:val="0"/>
+          <w:noProof/>
+          <w:sz w:val="20"/>
+        </w:rPr>
+        <w:t>(Sayer &amp; Banin 2016)</w:t>
+      </w:r>
+      <w:r>
+        <w:rPr>
+          <w:rStyle w:val="Textoennegrita"/>
+          <w:rFonts w:asciiTheme="majorHAnsi" w:hAnsiTheme="majorHAnsi" w:cstheme="majorHAnsi"/>
+          <w:b w:val="0"/>
+          <w:sz w:val="20"/>
+        </w:rPr>
+        <w:fldChar w:fldCharType="end"/>
+      </w:r>
+      <w:r>
+        <w:rPr>
+          <w:rStyle w:val="Textoennegrita"/>
+          <w:rFonts w:asciiTheme="majorHAnsi" w:hAnsiTheme="majorHAnsi" w:cstheme="majorHAnsi"/>
+          <w:b w:val="0"/>
+          <w:sz w:val="20"/>
+        </w:rPr>
+        <w:t xml:space="preserve"> Meta-analyzes of tropical mountains.</w:t>
+      </w:r>
+      <w:r>
+        <w:rPr>
+          <w:rStyle w:val="Textoennegrita"/>
+          <w:rFonts w:asciiTheme="majorHAnsi" w:hAnsiTheme="majorHAnsi" w:cstheme="majorHAnsi"/>
+          <w:b w:val="0"/>
+          <w:sz w:val="20"/>
+        </w:rPr>
+        <w:fldChar w:fldCharType="begin" w:fldLock="1"/>
+      </w:r>
+      <w:r>
+        <w:rPr>
+          <w:rStyle w:val="Textoennegrita"/>
+          <w:rFonts w:asciiTheme="majorHAnsi" w:hAnsiTheme="majorHAnsi" w:cstheme="majorHAnsi"/>
+          <w:b w:val="0"/>
+          <w:sz w:val="20"/>
+        </w:rPr>
+        <w:instrText>ADDIN CSL_CITATION {"citationItems":[{"id":"ITEM-1","itemData":{"DOI":"10.1017/S0266467415000619","ISSN":"14697831","abstract":"Tropical montane forests (TMF) are associated with a widely observed suite of characteristics encompassing forest structure, plant traits and biogeochemistry. With respect to nutrient relations, montane forests are characterized by slow decomposition of organic matter, high investment in below-ground biomass and poor litter quality, relative to tropical lowland forests. However, within TMF there is considerable variation in substrate age, parent material, disturbance and species composition. Here we emphasize that many TMFs are likely to be co-limited by multiple nutrients, and that feedback among soil properties, species traits, microbial communities and environmental conditions drive forest productivity and soil carbon storage. To date, studies of the biogeochemistry of montane forests have been restricted to a few, mostly neotropical, sites and focused mainly on trees while ignoring mycorrhizas, epiphytes and microbial community structure. Incorporating the geographic, environmental and biotic variability in TMF will lead to a greater recognition of plant-soil feedbacks that are critical to understanding constraints on productivity, both under present conditions and under future climate, nitrogen-deposition and land-use scenarios.","author":[{"dropping-particle":"","family":"Dalling","given":"James W.","non-dropping-particle":"","parse-names":false,"suffix":""},{"dropping-particle":"","family":"Heineman","given":"Katherine","non-dropping-particle":"","parse-names":false,"suffix":""},{"dropping-particle":"","family":"González","given":"Grizelle","non-dropping-particle":"","parse-names":false,"suffix":""},{"dropping-particle":"","family":"Ostertag","given":"Rebecca","non-dropping-particle":"","parse-names":false,"suffix":""}],"container-title":"Journal of Tropical Ecology","id":"ITEM-1","issue":"5","issued":{"date-parts":[["2016","9","1"]]},"page":"368-383","publisher":"Cambridge University Press","title":"Geographic, environmental and biotic sources of variation in the nutrient relations of tropical montane forests","type":"article-journal","volume":"32"},"uris":["http://www.mendeley.com/documents/?uuid=8c92cfc6-37d7-3593-aa4e-4bc85ccc58fc"]}],"mendeley":{"formattedCitation":"(Dalling et al. 2016)","plainTextFormattedCitation":"(Dalling et al. 2016)","previouslyFormattedCitation":"(Dalling et al. 2016)"},"properties":{"noteIndex":0},"schema":"https://github.com/citation-style-language/schema/raw/master/csl-citation.json"}</w:instrText>
+      </w:r>
+      <w:r>
+        <w:rPr>
+          <w:rStyle w:val="Textoennegrita"/>
+          <w:rFonts w:asciiTheme="majorHAnsi" w:hAnsiTheme="majorHAnsi" w:cstheme="majorHAnsi"/>
+          <w:b w:val="0"/>
+          <w:sz w:val="20"/>
+        </w:rPr>
+        <w:fldChar w:fldCharType="separate"/>
+      </w:r>
+      <w:r>
+        <w:rPr>
+          <w:rStyle w:val="Textoennegrita"/>
+          <w:rFonts w:asciiTheme="majorHAnsi" w:hAnsiTheme="majorHAnsi" w:cstheme="majorHAnsi"/>
+          <w:b w:val="0"/>
+          <w:noProof/>
+          <w:sz w:val="20"/>
+        </w:rPr>
+        <w:t>(Dalling et al. 2016)</w:t>
+      </w:r>
+      <w:r>
+        <w:rPr>
+          <w:rStyle w:val="Textoennegrita"/>
+          <w:rFonts w:asciiTheme="majorHAnsi" w:hAnsiTheme="majorHAnsi" w:cstheme="majorHAnsi"/>
+          <w:b w:val="0"/>
+          <w:sz w:val="20"/>
+        </w:rPr>
+        <w:fldChar w:fldCharType="end"/>
+      </w:r>
+      <w:r>
+        <w:rPr>
+          <w:rStyle w:val="Textoennegrita"/>
+          <w:rFonts w:asciiTheme="majorHAnsi" w:hAnsiTheme="majorHAnsi" w:cstheme="majorHAnsi"/>
+          <w:b w:val="0"/>
+          <w:sz w:val="20"/>
+        </w:rPr>
+        <w:t xml:space="preserve"> also an overview on nutrients on mountain forests.</w:t>
       </w:r>
     </w:p>
     <w:p>
@@ -468,14 +398,14 @@
           <w:rFonts w:asciiTheme="majorHAnsi" w:hAnsiTheme="majorHAnsi" w:cstheme="majorHAnsi"/>
           <w:sz w:val="20"/>
         </w:rPr>
-        <w:t>Montane tropical forests often exhibit complex biogeochemical limitations.</w:t>
-      </w:r>
-      <w:r>
-        <w:rPr>
-          <w:rFonts w:asciiTheme="majorHAnsi" w:hAnsiTheme="majorHAnsi" w:cstheme="majorHAnsi"/>
-          <w:sz w:val="20"/>
-        </w:rPr>
-        <w:t xml:space="preserve"> Evidence from NUMEX suggests that these ecosystems may be </w:t>
+        <w:t>NUMEX</w:t>
+      </w:r>
+      <w:r>
+        <w:rPr>
+          <w:rFonts w:asciiTheme="majorHAnsi" w:hAnsiTheme="majorHAnsi" w:cstheme="majorHAnsi"/>
+          <w:sz w:val="20"/>
+        </w:rPr>
+        <w:t xml:space="preserve"> is a long-term nutrient manipulation experiment established in </w:t>
       </w:r>
       <w:r>
         <w:rPr>
@@ -483,21 +413,74 @@
           <w:rFonts w:asciiTheme="majorHAnsi" w:hAnsiTheme="majorHAnsi" w:cstheme="majorHAnsi"/>
           <w:sz w:val="20"/>
         </w:rPr>
-        <w:t>co-limited by nitrogen and phosphorus</w:t>
-      </w:r>
-      <w:r>
-        <w:rPr>
-          <w:rFonts w:asciiTheme="majorHAnsi" w:hAnsiTheme="majorHAnsi" w:cstheme="majorHAnsi"/>
-          <w:sz w:val="20"/>
-        </w:rPr>
-        <w:t>, influencing nutrient cycling, productivity, and leaf functional traits.</w:t>
-      </w:r>
-      <w:r>
-        <w:rPr>
-          <w:rFonts w:asciiTheme="majorHAnsi" w:hAnsiTheme="majorHAnsi" w:cstheme="majorHAnsi"/>
-          <w:sz w:val="20"/>
-        </w:rPr>
-        <w:t xml:space="preserve"> Use available information from NUMEX.</w:t>
+        <w:t>2009</w:t>
+      </w:r>
+      <w:r>
+        <w:rPr>
+          <w:rFonts w:asciiTheme="majorHAnsi" w:hAnsiTheme="majorHAnsi" w:cstheme="majorHAnsi"/>
+          <w:sz w:val="20"/>
+        </w:rPr>
+        <w:t xml:space="preserve"> in a tropical montane forest, designed to evaluate ecosystem responses to sustained, moderate additions of nitrogen (N) and phosphorus (P).</w:t>
+      </w:r>
+    </w:p>
+    <w:p>
+      <w:pPr>
+        <w:pStyle w:val="NormalWeb"/>
+        <w:ind w:left="1080"/>
+        <w:rPr>
+          <w:rFonts w:asciiTheme="majorHAnsi" w:hAnsiTheme="majorHAnsi" w:cstheme="majorHAnsi"/>
+          <w:sz w:val="20"/>
+        </w:rPr>
+      </w:pPr>
+      <w:r>
+        <w:rPr>
+          <w:rFonts w:asciiTheme="majorHAnsi" w:hAnsiTheme="majorHAnsi" w:cstheme="majorHAnsi"/>
+          <w:sz w:val="20"/>
+        </w:rPr>
+        <w:t xml:space="preserve"> Use </w:t>
+      </w:r>
+      <w:r>
+        <w:rPr>
+          <w:rFonts w:asciiTheme="majorHAnsi" w:hAnsiTheme="majorHAnsi" w:cstheme="majorHAnsi"/>
+          <w:sz w:val="20"/>
+        </w:rPr>
+        <w:fldChar w:fldCharType="begin" w:fldLock="1"/>
+      </w:r>
+      <w:r>
+        <w:rPr>
+          <w:rFonts w:asciiTheme="majorHAnsi" w:hAnsiTheme="majorHAnsi" w:cstheme="majorHAnsi"/>
+          <w:sz w:val="20"/>
+        </w:rPr>
+        <w:instrText>ADDIN CSL_CITATION {"citationItems":[{"id":"ITEM-1","itemData":{"DOI":"10.1371/JOURNAL.PONE.0047128","ISSN":"19326203","PMID":"23071734","abstract":"Tropical regions are facing increasing atmospheric inputs of nutrients, which will have unknown consequences for the structure and functioning of these systems. Here, we show that Neotropical montane rainforests respond rapidly to moderate additions of N (50 kg ha-1 yr-1) and P (10 kg ha-1 yr-1). Monitoring of nutrient fluxes demonstrated that the majority of added nutrients remained in the system, in either soil or vegetation. N and P additions led to not only an increase in foliar N and P concentrations, but also altered soil microbial biomass, standing fine root biomass, stem growth, and litterfall. The different effects suggest that trees are primarily limited by P, whereas some processes-notably aboveground productivity-are limited by both N and P. Highly variable and partly contrasting responses of different tree species suggest marked changes in species composition and diversity of these forests by nutrient inputs in the long term. The unexpectedly fast response of the ecosystem to moderate nutrient additions suggests high vulnerability of tropical montane forests to the expected increase in nutrient inputs. © 2012 Homeier et al.","author":[{"dropping-particle":"","family":"Homeier","given":"Jürgen","non-dropping-particle":"","parse-names":false,"suffix":""},{"dropping-particle":"","family":"Hertel","given":"Dietrich","non-dropping-particle":"","parse-names":false,"suffix":""},{"dropping-particle":"","family":"Camenzind","given":"Tessa","non-dropping-particle":"","parse-names":false,"suffix":""},{"dropping-particle":"","family":"Cumbicus","given":"Nixon L.","non-dropping-particle":"","parse-names":false,"suffix":""},{"dropping-particle":"","family":"Maraun","given":"Mark","non-dropping-particle":"","parse-names":false,"suffix":""},{"dropping-particle":"","family":"Martinson","given":"Guntars O.","non-dropping-particle":"","parse-names":false,"suffix":""},{"dropping-particle":"","family":"Poma","given":"L. Nohemy","non-dropping-particle":"","parse-names":false,"suffix":""},{"dropping-particle":"","family":"Rillig","given":"Matthias C.","non-dropping-particle":"","parse-names":false,"suffix":""},{"dropping-particle":"","family":"Sandmann","given":"Dorothee","non-dropping-particle":"","parse-names":false,"suffix":""},{"dropping-particle":"","family":"Scheu","given":"Stefan","non-dropping-particle":"","parse-names":false,"suffix":""},{"dropping-particle":"","family":"Veldkamp","given":"Edzo","non-dropping-particle":"","parse-names":false,"suffix":""},{"dropping-particle":"","family":"Wilcke","given":"Wolfgang","non-dropping-particle":"","parse-names":false,"suffix":""},{"dropping-particle":"","family":"Wullaert","given":"Hans","non-dropping-particle":"","parse-names":false,"suffix":""},{"dropping-particle":"","family":"Leuschner","given":"Christoph","non-dropping-particle":"","parse-names":false,"suffix":""}],"container-title":"PLoS ONE","id":"ITEM-1","issue":"10","issued":{"date-parts":[["2012","10","10"]]},"page":"e47128","title":"Tropical Andean Forests Are Highly Susceptible to Nutrient Inputs—Rapid Effects of Experimental N and P Addition to an Ecuadorian Montane Forest","type":"article-journal","volume":"7"},"uris":["http://www.mendeley.com/documents/?uuid=27a9dcaf-0fa1-3c69-a1d3-90c4b9e1aa5c"]},{"id":"ITEM-2","itemData":{"DOI":"10.1111/btp.12518","ISSN":"17447429","abstract":"Global changes in nutrient deposition rates are likely to have profound effects on plant communities, particularly in the nutrient-limited systems of the tropics. We studied the effects of increased nutrient availability on the seedlings of six tree species in montane forests of southern Ecuador in situ. After five years of continued N, P, or N+P addition, naturally grown seedlings of each of the two most common species at each elevation (1000, 2000, and 3000 m asl) were harvested for analyses of leaf morphology, nutrient content, herbivory, and tissue biomass allocation. Most species showed increased foliar N and P concentrations after addition of each respective element. Leaf tissue N:P ratios of &gt;20 in the control plants of all species suggest that P is more growth-limiting in these forests than N. Leaf morphological responses to nutrient addition were species and nutrient specific, with some species (Hedyosmum purparescens, Graffenrieda emarginata) exhibiting increased specific leaf area (SLA), and others (Graffenrieda harlingii) increased leaf area ratios (LAR). Pouteria torta (1000 m) had lower SLA and LAR after P addition. Increased herbivory was only evident in G. emarginata (after N and N+P addition). Only the species from 3000 m asl modified biomass allocation after nutrient addition. In general, N and N+P addition more strongly affected the species studied at the upper elevations, whereas P addition had a similar range of effects on the species at all elevations. We conclude that the responses of the studied tropical montane forest tree seedlings to chronic N and P addition are highly species-specific and that successful adaptation to increased nutrient availability will depend on species-specific morphological and physiological plasticity.","author":[{"dropping-particle":"","family":"Cárate-Tandalla","given":"Daisy","non-dropping-particle":"","parse-names":false,"suffix":""},{"dropping-particle":"","family":"Camenzind","given":"Tessa","non-dropping-particle":"","parse-names":false,"suffix":""},{"dropping-particle":"","family":"Leuschner","given":"Christoph","non-dropping-particle":"","parse-names":false,"suffix":""},{"dropping-particle":"","family":"Homeier","given":"Jürgen","non-dropping-particle":"","parse-names":false,"suffix":""}],"container-title":"Biotropica","id":"ITEM-2","issue":"2","issued":{"date-parts":[["2018","3","1"]]},"page":"234-245","publisher":"Blackwell Publishing Ltd","title":"Contrasting species responses to continued nitrogen and phosphorus addition in tropical montane forest tree seedlings","type":"article-journal","volume":"50"},"uris":["http://www.mendeley.com/documents/?uuid=e18483b0-e8bf-3e51-a4ca-5661cac205b0"]}],"mendeley":{"formattedCitation":"(Homeier et al. 2012; Cárate-Tandalla et al. 2018a)","plainTextFormattedCitation":"(Homeier et al. 2012; Cárate-Tandalla et al. 2018a)","previouslyFormattedCitation":"(Homeier et al. 2012; Cárate-Tandalla et al. 2018a)"},"properties":{"noteIndex":0},"schema":"https://github.com/citation-style-language/schema/raw/master/csl-citation.json"}</w:instrText>
+      </w:r>
+      <w:r>
+        <w:rPr>
+          <w:rFonts w:asciiTheme="majorHAnsi" w:hAnsiTheme="majorHAnsi" w:cstheme="majorHAnsi"/>
+          <w:sz w:val="20"/>
+        </w:rPr>
+        <w:fldChar w:fldCharType="separate"/>
+      </w:r>
+      <w:r>
+        <w:rPr>
+          <w:rFonts w:asciiTheme="majorHAnsi" w:hAnsiTheme="majorHAnsi" w:cstheme="majorHAnsi"/>
+          <w:noProof/>
+          <w:sz w:val="20"/>
+        </w:rPr>
+        <w:t>(Homeier et al. 2012; Cárate-Tandalla et al. 2018a)</w:t>
+      </w:r>
+      <w:r>
+        <w:rPr>
+          <w:rFonts w:asciiTheme="majorHAnsi" w:hAnsiTheme="majorHAnsi" w:cstheme="majorHAnsi"/>
+          <w:sz w:val="20"/>
+        </w:rPr>
+        <w:fldChar w:fldCharType="end"/>
+      </w:r>
+      <w:r>
+        <w:rPr>
+          <w:rFonts w:asciiTheme="majorHAnsi" w:hAnsiTheme="majorHAnsi" w:cstheme="majorHAnsi"/>
+          <w:sz w:val="20"/>
+        </w:rPr>
+        <w:t xml:space="preserve"> for references on the experiment. </w:t>
       </w:r>
     </w:p>
     <w:p>
@@ -1139,6 +1122,7 @@
           <w:noProof/>
           <w:lang w:val="en-US"/>
         </w:rPr>
+        <w:lastRenderedPageBreak/>
         <w:drawing>
           <wp:inline distT="0" distB="0" distL="0" distR="0" wp14:anchorId="5B853734" wp14:editId="20A39F82">
             <wp:extent cx="5343525" cy="2916997"/>
@@ -1416,10 +1400,10 @@
         </w:rPr>
         <w:t xml:space="preserve">Which analysis? SMA has been done. </w:t>
       </w:r>
-      <w:proofErr w:type="gramStart"/>
-      <w:r>
-        <w:rPr>
-          <w:i/>
+      <w:r>
+        <w:rPr>
+          <w:i/>
+          <w:strike/>
           <w:sz w:val="20"/>
           <w:lang w:val="en-US"/>
         </w:rPr>
@@ -1428,6 +1412,7 @@
       <w:r>
         <w:rPr>
           <w:i/>
+          <w:strike/>
           <w:sz w:val="20"/>
           <w:lang w:val="en-US"/>
         </w:rPr>
@@ -1437,41 +1422,27 @@
       <w:r>
         <w:rPr>
           <w:i/>
+          <w:strike/>
           <w:sz w:val="20"/>
           <w:lang w:val="en-US"/>
         </w:rPr>
         <w:t>lmer</w:t>
       </w:r>
       <w:proofErr w:type="spellEnd"/>
-      <w:proofErr w:type="gramEnd"/>
-      <w:r>
-        <w:rPr>
-          <w:i/>
-          <w:sz w:val="20"/>
-          <w:lang w:val="en-US"/>
-        </w:rPr>
-        <w:t xml:space="preserve"> (R </w:t>
-      </w:r>
-      <w:r>
-        <w:rPr>
-          <w:i/>
-          <w:sz w:val="20"/>
-          <w:lang w:val="en-US"/>
-        </w:rPr>
-        <w:t>~</w:t>
-      </w:r>
-      <w:r>
-        <w:rPr>
-          <w:i/>
-          <w:sz w:val="20"/>
-          <w:lang w:val="en-US"/>
-        </w:rPr>
-        <w:t xml:space="preserve"> </w:t>
+      <w:r>
+        <w:rPr>
+          <w:i/>
+          <w:strike/>
+          <w:sz w:val="20"/>
+          <w:lang w:val="en-US"/>
+        </w:rPr>
+        <w:t xml:space="preserve"> (R ~ </w:t>
       </w:r>
       <w:proofErr w:type="spellStart"/>
       <w:r>
         <w:rPr>
           <w:i/>
+          <w:strike/>
           <w:sz w:val="20"/>
           <w:lang w:val="en-US"/>
         </w:rPr>
@@ -1481,6 +1452,7 @@
       <w:r>
         <w:rPr>
           <w:i/>
+          <w:strike/>
           <w:sz w:val="20"/>
           <w:lang w:val="en-US"/>
         </w:rPr>
@@ -1495,6 +1467,50 @@
           <w:lang w:val="en-US"/>
         </w:rPr>
       </w:pPr>
+      <w:r>
+        <w:rPr>
+          <w:i/>
+          <w:sz w:val="20"/>
+          <w:lang w:val="en-US"/>
+        </w:rPr>
+        <w:drawing>
+          <wp:inline distT="0" distB="0" distL="0" distR="0" wp14:anchorId="52606462" wp14:editId="7FDD45DD">
+            <wp:extent cx="5612130" cy="3962400"/>
+            <wp:effectExtent l="0" t="0" r="7620" b="0"/>
+            <wp:docPr id="2" name="Imagen 2"/>
+            <wp:cNvGraphicFramePr>
+              <a:graphicFrameLocks xmlns:a="http://schemas.openxmlformats.org/drawingml/2006/main" noChangeAspect="1"/>
+            </wp:cNvGraphicFramePr>
+            <a:graphic xmlns:a="http://schemas.openxmlformats.org/drawingml/2006/main">
+              <a:graphicData uri="http://schemas.openxmlformats.org/drawingml/2006/picture">
+                <pic:pic xmlns:pic="http://schemas.openxmlformats.org/drawingml/2006/picture">
+                  <pic:nvPicPr>
+                    <pic:cNvPr id="1" name=""/>
+                    <pic:cNvPicPr/>
+                  </pic:nvPicPr>
+                  <pic:blipFill>
+                    <a:blip r:embed="rId9"/>
+                    <a:stretch>
+                      <a:fillRect/>
+                    </a:stretch>
+                  </pic:blipFill>
+                  <pic:spPr>
+                    <a:xfrm>
+                      <a:off x="0" y="0"/>
+                      <a:ext cx="5612130" cy="3962400"/>
+                    </a:xfrm>
+                    <a:prstGeom prst="rect">
+                      <a:avLst/>
+                    </a:prstGeom>
+                  </pic:spPr>
+                </pic:pic>
+              </a:graphicData>
+            </a:graphic>
+          </wp:inline>
+        </w:drawing>
+      </w:r>
+      <w:bookmarkStart w:id="1" w:name="_GoBack"/>
+      <w:bookmarkEnd w:id="1"/>
     </w:p>
     <w:p>
       <w:pPr>
@@ -1504,6 +1520,15 @@
           <w:lang w:val="en-US"/>
         </w:rPr>
       </w:pPr>
+    </w:p>
+    <w:p>
+      <w:pPr>
+        <w:rPr>
+          <w:i/>
+          <w:sz w:val="20"/>
+          <w:lang w:val="en-US"/>
+        </w:rPr>
+      </w:pPr>
       <w:r>
         <w:rPr>
           <w:i/>
@@ -1511,6 +1536,7 @@
           <w:sz w:val="20"/>
           <w:lang w:val="en-US"/>
         </w:rPr>
+        <w:lastRenderedPageBreak/>
         <w:drawing>
           <wp:inline distT="0" distB="0" distL="0" distR="0" wp14:anchorId="5C7E510B" wp14:editId="74F7F620">
             <wp:extent cx="6565846" cy="2876550"/>
@@ -1529,7 +1555,7 @@
                     </pic:cNvPicPr>
                   </pic:nvPicPr>
                   <pic:blipFill rotWithShape="1">
-                    <a:blip r:embed="rId9"/>
+                    <a:blip r:embed="rId10"/>
                     <a:srcRect l="1056" t="18263" r="1343" b="2796"/>
                     <a:stretch/>
                   </pic:blipFill>
@@ -1574,7 +1600,7 @@
         </w:rPr>
         <w:t xml:space="preserve">aterial and methods – </w:t>
       </w:r>
-      <w:hyperlink r:id="rId10" w:history="1">
+      <w:hyperlink r:id="rId11" w:history="1">
         <w:r>
           <w:rPr>
             <w:rStyle w:val="Hipervnculo"/>
@@ -1658,7 +1684,6 @@
           <w:sz w:val="20"/>
           <w:lang w:val="en-US"/>
         </w:rPr>
-        <w:lastRenderedPageBreak/>
         <w:t xml:space="preserve"> </w:t>
       </w:r>
       <w:r>
@@ -2121,16 +2146,7 @@
           <w:sz w:val="20"/>
           <w:lang w:val="en-US"/>
         </w:rPr>
-        <w:t>In contrast, foliar nutrient concentrations responded to fert</w:t>
-      </w:r>
-      <w:bookmarkStart w:id="1" w:name="_GoBack"/>
-      <w:bookmarkEnd w:id="1"/>
-      <w:r>
-        <w:rPr>
-          <w:sz w:val="20"/>
-          <w:lang w:val="en-US"/>
-        </w:rPr>
-        <w:t>ilization in a species-dependent manner, highlighting strong interspecific variation in nutrient uptake and internal nutrient regulation strategies.</w:t>
+        <w:t>In contrast, foliar nutrient concentrations responded to fertilization in a species-dependent manner, highlighting strong interspecific variation in nutrient uptake and internal nutrient regulation strategies.</w:t>
       </w:r>
     </w:p>
     <w:p>
@@ -2141,6 +2157,7 @@
           <w:numId w:val="11"/>
         </w:numPr>
         <w:rPr>
+          <w:strike/>
           <w:sz w:val="20"/>
           <w:lang w:val="en-US"/>
         </w:rPr>
@@ -2148,6 +2165,7 @@
       <w:proofErr w:type="spellStart"/>
       <w:r>
         <w:rPr>
+          <w:strike/>
           <w:sz w:val="20"/>
           <w:lang w:val="en-US"/>
         </w:rPr>
@@ -2156,6 +2174,7 @@
       <w:proofErr w:type="spellEnd"/>
       <w:r>
         <w:rPr>
+          <w:strike/>
           <w:sz w:val="20"/>
           <w:lang w:val="en-US"/>
         </w:rPr>
@@ -2164,6 +2183,7 @@
       <w:proofErr w:type="spellStart"/>
       <w:r>
         <w:rPr>
+          <w:strike/>
           <w:sz w:val="20"/>
           <w:lang w:val="en-US"/>
         </w:rPr>
@@ -2172,6 +2192,7 @@
       <w:proofErr w:type="spellEnd"/>
       <w:r>
         <w:rPr>
+          <w:strike/>
           <w:sz w:val="20"/>
           <w:lang w:val="en-US"/>
         </w:rPr>
@@ -2186,12 +2207,14 @@
           <w:numId w:val="11"/>
         </w:numPr>
         <w:rPr>
-          <w:sz w:val="20"/>
-          <w:lang w:val="en-US"/>
-        </w:rPr>
-      </w:pPr>
-      <w:r>
-        <w:rPr>
+          <w:strike/>
+          <w:sz w:val="20"/>
+          <w:lang w:val="en-US"/>
+        </w:rPr>
+      </w:pPr>
+      <w:r>
+        <w:rPr>
+          <w:strike/>
           <w:sz w:val="20"/>
           <w:lang w:val="en-US"/>
         </w:rPr>
@@ -2206,12 +2229,14 @@
           <w:numId w:val="11"/>
         </w:numPr>
         <w:rPr>
-          <w:sz w:val="20"/>
-          <w:lang w:val="en-US"/>
-        </w:rPr>
-      </w:pPr>
-      <w:r>
-        <w:rPr>
+          <w:strike/>
+          <w:sz w:val="20"/>
+          <w:lang w:val="en-US"/>
+        </w:rPr>
+      </w:pPr>
+      <w:r>
+        <w:rPr>
+          <w:strike/>
           <w:sz w:val="20"/>
           <w:lang w:val="en-US"/>
         </w:rPr>
@@ -2308,12 +2333,14 @@
           <w:numId w:val="12"/>
         </w:numPr>
         <w:rPr>
-          <w:sz w:val="20"/>
-          <w:lang w:val="en-US"/>
-        </w:rPr>
-      </w:pPr>
-      <w:r>
-        <w:rPr>
+          <w:strike/>
+          <w:sz w:val="20"/>
+          <w:lang w:val="en-US"/>
+        </w:rPr>
+      </w:pPr>
+      <w:r>
+        <w:rPr>
+          <w:strike/>
           <w:sz w:val="20"/>
           <w:lang w:val="en-US"/>
         </w:rPr>
@@ -2322,6 +2349,7 @@
       <w:proofErr w:type="spellStart"/>
       <w:r>
         <w:rPr>
+          <w:strike/>
           <w:sz w:val="20"/>
           <w:lang w:val="en-US"/>
         </w:rPr>
@@ -2330,10 +2358,37 @@
       <w:proofErr w:type="spellEnd"/>
       <w:r>
         <w:rPr>
+          <w:strike/>
           <w:sz w:val="20"/>
           <w:lang w:val="en-US"/>
         </w:rPr>
         <w:t xml:space="preserve"> under nutrient addition.</w:t>
+      </w:r>
+      <w:r>
+        <w:rPr>
+          <w:strike/>
+          <w:sz w:val="20"/>
+          <w:lang w:val="en-US"/>
+        </w:rPr>
+        <w:t xml:space="preserve"> </w:t>
+      </w:r>
+      <w:proofErr w:type="spellStart"/>
+      <w:r>
+        <w:rPr>
+          <w:strike/>
+          <w:sz w:val="20"/>
+          <w:lang w:val="en-US"/>
+        </w:rPr>
+        <w:t>Gs</w:t>
+      </w:r>
+      <w:proofErr w:type="spellEnd"/>
+      <w:r>
+        <w:rPr>
+          <w:strike/>
+          <w:sz w:val="20"/>
+          <w:lang w:val="en-US"/>
+        </w:rPr>
+        <w:t xml:space="preserve"> does not change a lot.</w:t>
       </w:r>
     </w:p>
     <w:p>
@@ -2418,6 +2473,7 @@
           <w:sz w:val="20"/>
           <w:lang w:val="en-US"/>
         </w:rPr>
+        <w:lastRenderedPageBreak/>
         <w:t xml:space="preserve">Intrinsic water-use efficiency showed a consistent pattern along the </w:t>
       </w:r>
       <w:proofErr w:type="spellStart"/>
@@ -4708,7 +4764,7 @@
 </file>
 
 <file path=customXml/itemProps1.xml><?xml version="1.0" encoding="utf-8"?>
-<ds:datastoreItem xmlns:ds="http://schemas.openxmlformats.org/officeDocument/2006/customXml" ds:itemID="{D6454FB9-01DE-4F2C-B863-73FD7A5F55B4}">
+<ds:datastoreItem xmlns:ds="http://schemas.openxmlformats.org/officeDocument/2006/customXml" ds:itemID="{FB272D67-BF8C-4FE2-8ECA-7833E3527449}">
   <ds:schemaRefs>
     <ds:schemaRef ds:uri="http://schemas.openxmlformats.org/officeDocument/2006/bibliography"/>
   </ds:schemaRefs>

</xml_diff>